<commit_message>
Affiliation, Section 12 mechanism citation, and AI disclosure wording
- Set affiliation to Department of Microbiology, Iran University of
  Medical Sciences, Tehran, Iran (front matter, cover letter,
  checklist), consistent with the facility already named in Ethics
- Add Saito et al. 2017 (PNAS, R66) to Section 12: rifamycin action on
  RNA polymerase reproduces differentially detectable Mycobacterium
  tuberculosis experimentally, independent of any assay floor, in the
  same drug class every plate-sterile Evangelopoulos arm carries
- Rewrite the generative-AI disclosure to name what generative AI
  assistance covered in the analysis pipeline and in preparing the
  repository commits, mirrored in the cover letter, the submission
  checklist, and AI_DISCLOSURE.md
- Rebuild submission/ end to end (review copy, blinded copy, package,
  docx)

174 of 174 audit_claims checks agree; audit_manuscript reports 0 high
findings and no contradictions.
</commit_message>
<xml_diff>
--- a/submission/02_manuscript.docx
+++ b/submission/02_manuscript.docx
@@ -35,7 +35,7 @@
     </w:p>
     <w:p>
       <w:r>
-        <w:t>¹Independent Researcher, New York, NY, USA</w:t>
+        <w:t>¹Department of Microbiology, Iran University of Medical Sciences, Tehran, Iran</w:t>
       </w:r>
     </w:p>
     <w:p>
@@ -1687,7 +1687,7 @@
         <w:t>M. tuberculosis</w:t>
       </w:r>
       <w:r>
-        <w:t xml:space="preserve"> with a literature of its own: bacilli that require resuscitation-promoting factors to grow dominate pre-treatment sputum and rise as a proportion of the population during chemotherapy (8), and both resuscitation-promoting-factor-dependent and -independent differentially culturable populations are recovered from patients whose solid-medium cultures return nothing (9).</w:t>
+        <w:t xml:space="preserve"> with a literature of its own: bacilli that require resuscitation-promoting factors to grow dominate pre-treatment sputum and rise as a proportion of the population during chemotherapy (8), both resuscitation-promoting-factor-dependent and -independent differentially culturable populations are recovered from patients whose solid-medium cultures return nothing (9), and the mechanism has been reproduced experimentally: rifamycin action on RNA polymerase, independent of any assay's floor, converts a starved population to over 90 per cent differentially detectable in vitro (10) — the same drug class every arm of the Evangelopoulos regimen carries.</w:t>
       </w:r>
     </w:p>
     <w:p>
@@ -1760,7 +1760,7 @@
     </w:p>
     <w:p>
       <w:r>
-        <w:t>Why the adjustment does that is measurable. Isoniazid-resistant isolates go into this assay at 5.36 log10 against 6.36 for susceptible isolates, ten-fold thinner (Mann–Whitney p = 9.1 × 10⁻¹⁴) (10), and 22 of the 84 resistant isolates carrying an ordered label lack the headroom for the deepest endpoint, 26.2 per cent, against 9 of the 119 susceptible, 7.6 per cent. Those two counts are the 31 of Section 1, which is that section's 33 less the two isolates whose label is the unordered fourth category. They are one log short of observable killing before the experiment begins.</w:t>
+        <w:t>Why the adjustment does that is measurable. Isoniazid-resistant isolates go into this assay at 5.36 log10 against 6.36 for susceptible isolates, ten-fold thinner (Mann–Whitney p = 9.1 × 10⁻¹⁴) (11), and 22 of the 84 resistant isolates carrying an ordered label lack the headroom for the deepest endpoint, 26.2 per cent, against 9 of the 119 susceptible, 7.6 per cent. Those two counts are the 31 of Section 1, which is that section's 33 less the two isolates whose label is the unordered fourth category. They are one log short of observable killing before the experiment begins.</w:t>
       </w:r>
     </w:p>
     <w:p>
@@ -1782,7 +1782,7 @@
     </w:p>
     <w:p>
       <w:r>
-        <w:t>If the effect is a property of assay geometry rather than of clinical sampling, it should appear where one protocol, one strain and one stock are handed out deliberately. Van Wijk and colleagues (2023) ran exactly that exercise, sending a single stock of H37Rv to six blinded laboratories under one written protocol (11, 12). It does.</w:t>
+        <w:t>If the effect is a property of assay geometry rather than of clinical sampling, it should appear where one protocol, one strain and one stock are handed out deliberately. Van Wijk and colleagues (2023) ran exactly that exercise, sending a single stock of H37Rv to six blinded laboratories under one written protocol (12, 13). It does.</w:t>
       </w:r>
     </w:p>
     <w:p>
@@ -1860,7 +1860,7 @@
         <w:t>Escherichia coli</w:t>
       </w:r>
       <w:r>
-        <w:t xml:space="preserve"> in a hollow-fibre system (13, 14). Their Methods state 100 µL plated with counts per mL, so </w:t>
+        <w:t xml:space="preserve"> in a hollow-fibre system (14, 15). Their Methods state 100 µL plated with counts per mL, so </w:t>
       </w:r>
       <w:r>
         <w:rPr>
@@ -2077,17 +2077,17 @@
         <w:t>Volume Transferred</w:t>
       </w:r>
       <w:r>
-        <w:t>, ties the volume to the endpoint with a counting rule: after the defined 99.9 per cent killing, at least ten colonies must remain (15) — for a standard inoculum of 5 × 10⁵ per mL that means at least 20 µL streaked, so a 10 µL streak fails the rule, and section 3.1 separately requires the smallest detectable count to be established by serial dilution. A guideline written in 1999 already required both numbers this paper asks for. The deposits reanalysed here do not meet it, not for lack of care but because the endpoint moved: M26-A nowhere contemplates a four-log call, and the volume rule did not travel with the deeper endpoints.</w:t>
+        <w:t>, ties the volume to the endpoint with a counting rule: after the defined 99.9 per cent killing, at least ten colonies must remain (16) — for a standard inoculum of 5 × 10⁵ per mL that means at least 20 µL streaked, so a 10 µL streak fails the rule, and section 3.1 separately requires the smallest detectable count to be established by serial dilution. A guideline written in 1999 already required both numbers this paper asks for. The deposits reanalysed here do not meet it, not for lack of care but because the endpoint moved: M26-A nowhere contemplates a four-log call, and the volume rule did not travel with the deeper endpoints.</w:t>
       </w:r>
     </w:p>
     <w:p>
       <w:r>
-        <w:t>Take the assay's contribution out and what is left makes biological sense. Growth state predicts the tolerance class before and after adjustment for starting density — isoniazid needs KatG and active cell-wall synthesis (16), rifampicin needs transcription (17), and a population that is not dividing offers less of what these drugs act on. The classification is reading physiological state, not drug susceptibility.</w:t>
+        <w:t>Take the assay's contribution out and what is left makes biological sense. Growth state predicts the tolerance class before and after adjustment for starting density — isoniazid needs KatG and active cell-wall synthesis (17), rifampicin needs transcription (18), and a population that is not dividing offers less of what these drugs act on. The classification is reading physiological state, not drug susceptibility.</w:t>
       </w:r>
     </w:p>
     <w:p>
       <w:r>
-        <w:t>That axis is the one tuberculosis drug development already leans on. Killing assays of this design rank regimens before they enter trials, and tolerance followed in patients is now being read as within-host evolution (18). If a tolerance classification is partly an inoculum measurement, conclusions drawn from it — that one regimen sterilises faster than another, that a patient's isolates are becoming more tolerant over therapy — are in part conclusions about how the assay was set up. The correction applied here does not remove the biology; it aims it at the right target. The phenotype that survives the correction is growth state, which is real, targetable and directly measurable, unlike a fraction read off a floor.</w:t>
+        <w:t>That axis is the one tuberculosis drug development already leans on. Killing assays of this design rank regimens before they enter trials, and tolerance followed in patients is now being read as within-host evolution (19). If a tolerance classification is partly an inoculum measurement, conclusions drawn from it — that one regimen sterilises faster than another, that a patient's isolates are becoming more tolerant over therapy — are in part conclusions about how the assay was set up. The correction applied here does not remove the biology; it aims it at the right target. The phenotype that survives the correction is growth state, which is real, targetable and directly measurable, unlike a fraction read off a floor.</w:t>
       </w:r>
     </w:p>
     <w:p>
@@ -2918,7 +2918,7 @@
     </w:p>
     <w:p>
       <w:r>
-        <w:t>Anthropic's Claude (Opus 5) was used under the author's direction to copy-edit and language-edit the manuscript text, including the text of the version submitted. That is the whole of it: no figure, image or schematic was generated by an artificial intelligence tool; every figure is plotted from values that regenerate from the public deposits. No artificial intelligence tool is an author. The author directed the study, verified every reported quantity against the source deposits and the regenerating pipeline, and takes full responsibility for the content of this article, including its accuracy and its originality.</w:t>
+        <w:t>Anthropic's Claude was used under the author's direction to read the manuscript and to assist in running the Python analysis pipeline. Claude Sonnet 5 was further used, under the author's direction, to document and organise the analysis code and to prepare its commits to the version-controlled repository. No figure, image or schematic was generated by an artificial intelligence tool; every figure is plotted from values that regenerate from the public deposits. No artificial intelligence tool is an author. The author directed the study, verified every reported quantity against the source deposits and the regenerating pipeline, and takes full responsibility for the content of this article, including its accuracy and its originality.</w:t>
       </w:r>
     </w:p>
     <w:p>
@@ -2935,12 +2935,12 @@
     </w:p>
     <w:p>
       <w:r>
-        <w:t>Every dataset reanalysed here was already public under an open licence and none was generated for this study. Each is identified in Table 3 and cited alongside the article that first described it: Vijay and colleagues (19, 20), van Wijk and colleagues (11, 12), Windels and colleagues (21, 22), Kaur and colleagues (23, 24), and the hollow-fibre Source Data of Dubey and colleagues (13, 14), held out of every fitting step. The readings from the prospective experiment are deposited with the analysis code.</w:t>
+        <w:t>Every dataset reanalysed here was already public under an open licence and none was generated for this study. Each is identified in Table 3 and cited alongside the article that first described it: Vijay and colleagues (20, 21), van Wijk and colleagues (12, 13), Windels and colleagues (22, 23), Kaur and colleagues (24, 25), and the hollow-fibre Source Data of Dubey and colleagues (14, 15), held out of every fitting step. The readings from the prospective experiment are deposited with the analysis code.</w:t>
       </w:r>
     </w:p>
     <w:p>
       <w:r>
-        <w:t>That code, both audit scripts, the headroom tool and the machine-readable receipts recording the software versions each stage ran under are in a public repository (25), with the documentation and test data needed to run them. It is dual-licensed: the code under the Massachusetts Institute of Technology (MIT) licence, and the manuscript, figures and results under CC BY 4.0. The deposits keep their depositors' own licences. It is at https://github.com/piranfar/detection-floor-tolerance-endpoints, and this manuscript was built from commit 7722ac3+ of it — the state of the repository the text describes, rather than the commit that records the build. A trailing plus sign, if present, marks a build made with uncommitted changes in the tree.</w:t>
+        <w:t>That code, both audit scripts, the headroom tool and the machine-readable receipts recording the software versions each stage ran under are in a public repository (26), with the documentation and test data needed to run them. It is dual-licensed: the code under the Massachusetts Institute of Technology (MIT) licence, and the manuscript, figures and results under CC BY 4.0. The deposits keep their depositors' own licences. It is at https://github.com/piranfar/detection-floor-tolerance-endpoints, and this manuscript was built from commit ada65b7+ of it — the state of the repository the text describes, rather than the commit that records the build. A trailing plus sign, if present, marks a build made with uncommitted changes in the tree.</w:t>
       </w:r>
     </w:p>
     <w:p>
@@ -5400,7 +5400,7 @@
               <w:rPr>
                 <w:sz w:val="18"/>
               </w:rPr>
-              <w:t>Zenodo 7550302 (22)</w:t>
+              <w:t>Zenodo 7550302 (23)</w:t>
             </w:r>
           </w:p>
         </w:tc>
@@ -5762,12 +5762,17 @@
     </w:p>
     <w:p>
       <w:r>
-        <w:t>10. Mann HB, Whitney DR. 1947. On a test of whether one of two random variables is stochastically larger than the other. Ann Math Stat 18:50-60. https://doi.org/10.1214/aoms/1177730491.</w:t>
+        <w:t>10. Saito K, Warrier T, Somersan-Karakaya S, Kaminski L, Mi J, Jiang X, Park S, Shigyo K, Gold B, Roberts J, Weber E, Jacobs WR Jr, Nathan CF. 2017. Rifamycin action on RNA polymerase in antibiotic-tolerant Mycobacterium tuberculosis results in differentially detectable populations. Proc Natl Acad Sci U S A 114:E4832-E4840. https://doi.org/10.1073/pnas.1705385114.</w:t>
       </w:r>
     </w:p>
     <w:p>
       <w:r>
-        <w:t xml:space="preserve">11. van Wijk RC, Lucía A, Sudhakar PK, Sonnenkalb L, Gaudin C, Hoffmann E, Dremierre B, Aguilar-Ayala DA, Dal Molin M, Rybniker J, de Giorgi S, Cioetto-Mazzabò L, Segafreddo G, Manganelli R, Degiacomi G, Recchia D, Pasca MR, Simonsson USH, Ramón-García S. 2023. Implementing best practices on data generation and reporting of </w:t>
+        <w:t>11. Mann HB, Whitney DR. 1947. On a test of whether one of two random variables is stochastically larger than the other. Ann Math Stat 18:50-60. https://doi.org/10.1214/aoms/1177730491.</w:t>
+      </w:r>
+    </w:p>
+    <w:p>
+      <w:r>
+        <w:t xml:space="preserve">12. van Wijk RC, Lucía A, Sudhakar PK, Sonnenkalb L, Gaudin C, Hoffmann E, Dremierre B, Aguilar-Ayala DA, Dal Molin M, Rybniker J, de Giorgi S, Cioetto-Mazzabò L, Segafreddo G, Manganelli R, Degiacomi G, Recchia D, Pasca MR, Simonsson USH, Ramón-García S. 2023. Implementing best practices on data generation and reporting of </w:t>
       </w:r>
       <w:r>
         <w:rPr>
@@ -5781,7 +5786,7 @@
     </w:p>
     <w:p>
       <w:r>
-        <w:t xml:space="preserve">12. van Wijk RC, Lucía Quintana A, Ramón-García S. 2023. </w:t>
+        <w:t xml:space="preserve">13. van Wijk RC, Lucía Quintana A, Ramón-García S. 2023. </w:t>
       </w:r>
       <w:r>
         <w:rPr>
@@ -5795,7 +5800,7 @@
     </w:p>
     <w:p>
       <w:r>
-        <w:t xml:space="preserve">13. Dubey V, Darlow C, Gerada A, Unsworth J, Sheth E, Reza N, Farrington N, Haldenby S, Warren D, Liu X, Howard A, Hope W. 2026. Molecular pharmacodynamics of amoxicillin-clavulanic acid for urinary tract infections caused by </w:t>
+        <w:t xml:space="preserve">14. Dubey V, Darlow C, Gerada A, Unsworth J, Sheth E, Reza N, Farrington N, Haldenby S, Warren D, Liu X, Howard A, Hope W. 2026. Molecular pharmacodynamics of amoxicillin-clavulanic acid for urinary tract infections caused by </w:t>
       </w:r>
       <w:r>
         <w:rPr>
@@ -5809,7 +5814,7 @@
     </w:p>
     <w:p>
       <w:r>
-        <w:t xml:space="preserve">14. Dubey V, Darlow C, Gerada A, Unsworth J, Sheth E, Reza N, Farrington N, Haldenby S, Warren D, Liu X, Howard A, Hope W. 2026. Source Data to "Molecular pharmacodynamics of amoxicillin-clavulanic acid for urinary tract infections caused by </w:t>
+        <w:t xml:space="preserve">15. Dubey V, Darlow C, Gerada A, Unsworth J, Sheth E, Reza N, Farrington N, Haldenby S, Warren D, Liu X, Howard A, Hope W. 2026. Source Data to "Molecular pharmacodynamics of amoxicillin-clavulanic acid for urinary tract infections caused by </w:t>
       </w:r>
       <w:r>
         <w:rPr>
@@ -5823,22 +5828,22 @@
     </w:p>
     <w:p>
       <w:r>
-        <w:t>15. National Committee for Clinical Laboratory Standards. 1999. Methods for determining bactericidal activity of antimicrobial agents; approved guideline. NCCLS document M26-A. National Committee for Clinical Laboratory Standards, Wayne, PA. ISBN 1-56238-384-1.</w:t>
+        <w:t>16. National Committee for Clinical Laboratory Standards. 1999. Methods for determining bactericidal activity of antimicrobial agents; approved guideline. NCCLS document M26-A. National Committee for Clinical Laboratory Standards, Wayne, PA. ISBN 1-56238-384-1.</w:t>
       </w:r>
     </w:p>
     <w:p>
       <w:r>
-        <w:t>16. Vilchèze C, Jacobs WR Jr. 2007. The mechanism of isoniazid killing: clarity through the scope of genetics. Annu Rev Microbiol 61:35-50. https://doi.org/10.1146/annurev.micro.61.111606.122346.</w:t>
+        <w:t>17. Vilchèze C, Jacobs WR Jr. 2007. The mechanism of isoniazid killing: clarity through the scope of genetics. Annu Rev Microbiol 61:35-50. https://doi.org/10.1146/annurev.micro.61.111606.122346.</w:t>
       </w:r>
     </w:p>
     <w:p>
       <w:r>
-        <w:t>17. Campbell EA, Korzheva N, Mustaev A, Murakami K, Nair S, Goldfarb A, Darst SA. 2001. Structural mechanism for rifampicin inhibition of bacterial RNA polymerase. Cell 104:901-912. https://doi.org/10.1016/S0092-8674(01)00286-0.</w:t>
+        <w:t>18. Campbell EA, Korzheva N, Mustaev A, Murakami K, Nair S, Goldfarb A, Darst SA. 2001. Structural mechanism for rifampicin inhibition of bacterial RNA polymerase. Cell 104:901-912. https://doi.org/10.1016/S0092-8674(01)00286-0.</w:t>
       </w:r>
     </w:p>
     <w:p>
       <w:r>
-        <w:t xml:space="preserve">18. March VFA, Mchedlishvili K, Goig GA, Maghradze N, Avaliani T, Aspindzelashvili R, Avaliani Z, Kipiani M, Tukvadze N, Jugheli L, Bouaouina S, Doetsch A, Kalkan S, Reinhardt M, Gagneux S, Borrell S. 2025. Within-host evolution of drug tolerance in </w:t>
+        <w:t xml:space="preserve">19. March VFA, Mchedlishvili K, Goig GA, Maghradze N, Avaliani T, Aspindzelashvili R, Avaliani Z, Kipiani M, Tukvadze N, Jugheli L, Bouaouina S, Doetsch A, Kalkan S, Reinhardt M, Gagneux S, Borrell S. 2025. Within-host evolution of drug tolerance in </w:t>
       </w:r>
       <w:r>
         <w:rPr>
@@ -5852,7 +5857,7 @@
     </w:p>
     <w:p>
       <w:r>
-        <w:t xml:space="preserve">19. Vijay S, Bao NLH, Vinh DN, Nhat LTH, Thu DDA, Quang NL, Trieu LPT, Nhung HN, Ha VTN, Thai PVK, Ha DTM, Lan NH, Caws M, Thwaites GE, Javid B, Thuong NT. 2024. Supplementary file 2 to "Rifampicin tolerance and growth fitness among isoniazid-resistant clinical </w:t>
+        <w:t xml:space="preserve">20. Vijay S, Bao NLH, Vinh DN, Nhat LTH, Thu DDA, Quang NL, Trieu LPT, Nhung HN, Ha VTN, Thai PVK, Ha DTM, Lan NH, Caws M, Thwaites GE, Javid B, Thuong NT. 2024. Supplementary file 2 to "Rifampicin tolerance and growth fitness among isoniazid-resistant clinical </w:t>
       </w:r>
       <w:r>
         <w:rPr>
@@ -5866,7 +5871,7 @@
     </w:p>
     <w:p>
       <w:r>
-        <w:t xml:space="preserve">20. Vijay S, Bao NLH, Vinh DN, Nhat LTH, Thu DDA, Quang NL, Trieu LPT, Nhung HN, Ha VTN, Thai PVK, Ha DTM, Lan NH, Caws M, Thwaites GE, Javid B, Thuong NT. 2024. Rifampicin tolerance and growth fitness among isoniazid-resistant clinical </w:t>
+        <w:t xml:space="preserve">21. Vijay S, Bao NLH, Vinh DN, Nhat LTH, Thu DDA, Quang NL, Trieu LPT, Nhung HN, Ha VTN, Thai PVK, Ha DTM, Lan NH, Caws M, Thwaites GE, Javid B, Thuong NT. 2024. Rifampicin tolerance and growth fitness among isoniazid-resistant clinical </w:t>
       </w:r>
       <w:r>
         <w:rPr>
@@ -5880,17 +5885,17 @@
     </w:p>
     <w:p>
       <w:r>
-        <w:t>21. Windels EM, Cool L, Persy E, Swinnen J, Matthay P, Van den Bergh B, Wenseleers T, Michiels J. 2024. Data supporting "Antibiotic dose and nutrient availability differentially drive the evolution of antibiotic resistance and persistence". Zenodo. https://doi.org/10.5281/zenodo.7550302.</w:t>
+        <w:t>22. Windels EM, Cool L, Persy E, Swinnen J, Matthay P, Van den Bergh B, Wenseleers T, Michiels J. 2024. Data supporting "Antibiotic dose and nutrient availability differentially drive the evolution of antibiotic resistance and persistence". Zenodo. https://doi.org/10.5281/zenodo.7550302.</w:t>
       </w:r>
     </w:p>
     <w:p>
       <w:r>
-        <w:t>22. Windels EM, Cool L, Persy E, Swinnen J, Matthay P, Van den Bergh B, Wenseleers T, Michiels J. 2024. Antibiotic dose and nutrient availability differentially drive the evolution of antibiotic resistance and persistence. ISME J 18:wrae070. https://doi.org/10.1093/ismejo/wrae070.</w:t>
+        <w:t>23. Windels EM, Cool L, Persy E, Swinnen J, Matthay P, Van den Bergh B, Wenseleers T, Michiels J. 2024. Antibiotic dose and nutrient availability differentially drive the evolution of antibiotic resistance and persistence. ISME J 18:wrae070. https://doi.org/10.1093/ismejo/wrae070.</w:t>
       </w:r>
     </w:p>
     <w:p>
       <w:r>
-        <w:t xml:space="preserve">23. Kaur P. 2024. Apramycin kills replicating and non-replicating </w:t>
+        <w:t xml:space="preserve">24. Kaur P. 2024. Apramycin kills replicating and non-replicating </w:t>
       </w:r>
       <w:r>
         <w:rPr>
@@ -5904,7 +5909,7 @@
     </w:p>
     <w:p>
       <w:r>
-        <w:t xml:space="preserve">24. Kaur P, Ramya VK, Naveenkumar CN, Bharathkumar K, Singh M, Hobbie SN, Shandil RK, Narayanan S. 2024. Apramycin kills replicating and non-replicating </w:t>
+        <w:t xml:space="preserve">25. Kaur P, Ramya VK, Naveenkumar CN, Bharathkumar K, Singh M, Hobbie SN, Shandil RK, Narayanan S. 2024. Apramycin kills replicating and non-replicating </w:t>
       </w:r>
       <w:r>
         <w:rPr>
@@ -5918,7 +5923,7 @@
     </w:p>
     <w:p>
       <w:r>
-        <w:t>25. Piranfar V. 2026. Analysis code, audit scripts and headroom tool for "The detection floor bounds tolerance endpoints in Mycobacterium tuberculosis". GitHub. https://github.com/piranfar/detection-floor-tolerance-endpoints.</w:t>
+        <w:t>26. Piranfar V. 2026. Analysis code, audit scripts and headroom tool for "The detection floor bounds tolerance endpoints in Mycobacterium tuberculosis". GitHub. https://github.com/piranfar/detection-floor-tolerance-endpoints.</w:t>
       </w:r>
     </w:p>
     <w:sectPr>

</xml_diff>

<commit_message>
Rewrite Results and Discussion for a tighter, less hedged voice
Condensed the Kaur (apramycin) and Windels (evolved clones) analyses
into a single section instead of two, fixed a leftover splice error
that had displaced the differential-culturability subsection out of
its correct place in the numbering, and rewrote several passages that
had drifted into a defensive, over-qualified tone back into plain
declarative statements.

Updated the routing table in build_submission.py to match the new
section numbers, since it decides which sections stay in the main text
versus move to the supplement by section number, and the renumbering
would otherwise have silently swapped two sections' routing.

Full chain rebuilt clean: 174/174 claims verified, 0 high/0 medium
findings from the manuscript audit.
</commit_message>
<xml_diff>
--- a/submission/02_manuscript.docx
+++ b/submission/02_manuscript.docx
@@ -1380,12 +1380,17 @@
     </w:p>
     <w:p>
       <w:r>
-        <w:t>The most probable number (MPN) readings can only take the discrete values of an MPN table (5, 6) (a fixed ladder of rungs, not a continuous scale). The day-5 column does not taper towards zero. It stops. Eighteen isolates sit at exactly 23 per mL in the 15-day panel and six in the 60-day panel, and nothing in the file lies below that (Fig. 1A). That is a floor, not a tail, and it is treated as one throughout.</w:t>
+        <w:t>Most-probable-number (MPN) readings take only the discrete values of an MPN table (5, 6), a fixed ladder of rungs, not a continuous scale. The day-5 column does not taper towards zero. It stops. Eighteen isolates sit at exactly 23 per mL in the 15-day panel and six in the 60-day panel, and nothing in the file lies below that (Fig. 1A). That is a floor, not a tail, and it is treated as one throughout.</w:t>
       </w:r>
     </w:p>
     <w:p>
       <w:r>
-        <w:t xml:space="preserve">Each isolate therefore carries a fixed budget of killing the assay can see. At 15 days of prior culture the starting densities run from 2 300 to 61 000 000 per mL (3.36 to 7.79 log10), so headroom, the distance from the starting density down to the floor, runs from 2.00 to 6.42 log10 (Fig. 1B, Table 1). Both spans are the same 4.42 log10. Subtracting the displayed endpoints does not reproduce that, and should not: every log10 here is computed from the raw most-probable-number rungs against a floor of 23 per mL and rounded once, at the end, so the deepest headroom displays as 6.42 rather than as the 6.43 that 7.79 minus 1.36 returns. The fold figures quoted throughout are likewise ten raised to the unrounded difference rather than to the displayed one. Against that budget the three deposited endpoints behave very differently. Every isolate has the room for a 90 or a 99 per cent reduction: 0 of 217 fall short in both cases. </w:t>
+        <w:t>Each isolate therefore carries a fixed budget of killing the assay can see. At 15 days of prior culture the starting densities run from 2,300 to 61,000,000 per mL (3.36 to 7.79 log10), so headroom, the distance from the starting density down to the floor, runs from 2.00 to 6.42 log10 (Fig. 1B, Table 1): both spans are the same 4.42 log10. Every log10 here is computed from the raw MPN rungs against a floor of 23 per mL and rounded once, at the end, so the deepest headroom displays as 6.42 rather than as the 6.43 that 7.79 minus 1.36 returns; the fold figures quoted throughout are likewise ten raised to the unrounded difference.</w:t>
+      </w:r>
+    </w:p>
+    <w:p>
+      <w:r>
+        <w:t xml:space="preserve">Against that budget the three deposited endpoints behave very differently. Every isolate has room for a 90 or a 99 per cent reduction: 0 of 217 fall short in either case. </w:t>
       </w:r>
       <w:r>
         <w:rPr>
@@ -1394,7 +1399,7 @@
         <w:t>Thirty-three of 217 isolates (15.2 per cent) lack the headroom for the 99.99 per cent endpoint</w:t>
       </w:r>
       <w:r>
-        <w:t>, which is to say that a four-log reduction was unobservable for them before rifampicin was added. Two of those 33 carry a fourth label that the deposit writes literally as "MDR", conventionally multidrug-resistant. It is unordered with respect to the other three, so no ordered analysis can place it (Table S2); over the 203 isolates with an ordered label the same count is 31.</w:t>
+        <w:t>, a four-log reduction that was unobservable for them before rifampicin was added. Two of those 33 carry a fourth label the deposit writes literally as "MDR" (conventionally multidrug-resistant), unordered with respect to the other three, so no ordered analysis can place it (Table S2); over the 203 isolates with an ordered label the count is 31.</w:t>
       </w:r>
     </w:p>
     <w:p>
@@ -1408,7 +1413,7 @@
         <w:t>assay ceiling</w:t>
       </w:r>
       <w:r>
-        <w:t xml:space="preserve">. That is a census of the affected isolates, not an estimate. The ceiling is a different censoring mechanism from the floor and should not be read as its mirror. The floor censors the count: anything below </w:t>
+        <w:t xml:space="preserve">, a census rather than an estimate. The ceiling is a different censoring mechanism from the floor: the floor censors the count (anything below </w:t>
       </w:r>
       <w:r>
         <w:rPr>
@@ -1417,7 +1422,7 @@
         <w:t>L</w:t>
       </w:r>
       <w:r>
-        <w:t xml:space="preserve"> is not reported as a count. The ceiling censors time: the killing assay runs six days, so an isolate that has not reached its endpoint by then is recorded at the last day rather than at the day it would have reached. One sets how deep the assay can see, the other how long it looks. Among the 184 isolates that did have four logs of headroom, 162 are also at the ceiling, 88.0 per cent.</w:t>
+        <w:t xml:space="preserve"> is not reported as a count), the ceiling censors time (the assay runs six days, so an isolate that has not reached its endpoint by then is recorded at the last day rather than the day it would have reached). One sets how deep the assay can see, the other how long it looks. Among the 184 isolates that did have four logs of headroom, 162 are also at the ceiling, 88.0 per cent.</w:t>
       </w:r>
     </w:p>
     <w:p>
@@ -1434,12 +1439,12 @@
     </w:p>
     <w:p>
       <w:r>
-        <w:t>The deposited tolerance level is a cut-off on the recorded surviving fraction, with no overlap between classes. The thresholds themselves are not deposited. They are recovered here, and the data pin them only to the gaps between classes: at day 5 and 15 days of prior culture, low tolerance covers fractions below 10⁻³, medium covers 10⁻³ to 10⁻², and high exceeds 10⁻². Those cuts reproduce every usable class in the file, 203 of 203 (Table S3). Usable means the 203 of 217 isolates whose label is one of the three ordered classes; the other 14 carry the fourth, unordered category, the "MDR" label above, that no ordered analysis can place (Table S2). So what follows is an argument about the fraction the assay recorded, not about an independent clinical judgement.</w:t>
+        <w:t>The deposited tolerance level is a cut-off on the recorded surviving fraction, with no overlap between classes. The thresholds themselves are not deposited; recovered here, at day 5 and 15 days of prior culture, low tolerance covers fractions below 10⁻³, medium 10⁻³ to 10⁻², high above 10⁻². Those cuts reproduce every usable class in the file, 203 of 203 (Table S3). Usable means the 203 of 217 isolates whose label is one of the three ordered classes; the other 14 carry the "MDR" category, which no ordered analysis can place (Table S2). What follows is an argument about the fraction the assay recorded, not about an independent clinical judgement.</w:t>
       </w:r>
     </w:p>
     <w:p>
       <w:r>
-        <w:t xml:space="preserve">Eighteen isolates ended at the floor. They share one reported floor-level observation, but their true final counts are unknown below the floor, so the assay cannot tell their surviving burdens apart down there. That is not the same as saying they were killed to the same degree, and the difference matters. Their starting densities span 265-fold, from 23 000 to 6.1 × 10⁶ per mL, so the same terminal reading implies a different range of compatible reductions in each. An isolate that began at 23 000 has demonstrated at least a 3.00-log reduction; one that began at 6.1 × 10⁶ at least 5.42 logs. In either case the true reduction may be anything from that bound down to complete kill. What the deposit records instead is a single number per isolate, </w:t>
+        <w:t xml:space="preserve">Eighteen isolates ended at the floor. They share one reported floor-level observation, but their true final counts are unknown below the floor, so the assay cannot tell their surviving burdens apart down there. That is not the same as saying they were killed to the same degree. Their starting densities span 265-fold, from 23,000 to 6.1 × 10⁶ per mL, so the same terminal reading implies a different range of compatible reductions in each: at least 3.00 log reduction for the isolate that began at 23,000, at least 5.42 logs for the one that began at 6.1 × 10⁶, and in either case the true reduction may be anything from that bound down to complete kill. What the deposit records instead is a single number per isolate, </w:t>
       </w:r>
       <w:r>
         <w:rPr>
@@ -1457,12 +1462,12 @@
         <w:t>N₀</w:t>
       </w:r>
       <w:r>
-        <w:t>, and those recorded fractions span 265-fold, from 3.8 × 10⁻⁶ to 1.0 × 10⁻³, exactly the span of the starting densities (Fig. 1C), because that is what the ratio is. They are upper bounds on survival, not measurements of it.</w:t>
+        <w:t>, and those recorded fractions span the same 265-fold, from 3.8 × 10⁻⁶ to 1.0 × 10⁻³ (Fig. 1C), because that is what the ratio is. They are upper bounds on survival, not measurements of it.</w:t>
       </w:r>
     </w:p>
     <w:p>
       <w:r>
-        <w:t xml:space="preserve">The labels those eighteen received differ. Six isolates that began at 23 000 per mL received a fraction of 10⁻³ and were classified </w:t>
+        <w:t xml:space="preserve">The labels those eighteen received differ accordingly. Six isolates that began at 23,000 per mL recorded a fraction of 10⁻³ and were classified </w:t>
       </w:r>
       <w:r>
         <w:rPr>
@@ -1471,7 +1476,7 @@
         <w:t>medium</w:t>
       </w:r>
       <w:r>
-        <w:t xml:space="preserve"> tolerance; twelve that began at 230 000 or above received 10⁻⁴ or less and were classified </w:t>
+        <w:t xml:space="preserve"> tolerance; twelve that began at 230,000 or above recorded 10⁻⁴ or less and were classified </w:t>
       </w:r>
       <w:r>
         <w:rPr>
@@ -1480,12 +1485,7 @@
         <w:t>low</w:t>
       </w:r>
       <w:r>
-        <w:t>. A single cut on the starting density alone reproduces all eighteen (Table 2). That is a statement about the classification step and not about the killing: once a reading is censored at the floor, the starting density fixes which label the published rule is able to return.</w:t>
-      </w:r>
-    </w:p>
-    <w:p>
-      <w:r>
-        <w:t>So for twelve of the eighteen the recorded label carries no information beyond the fact that the reading was censored, and for six it is not determinate at all. None of the eighteen is a measurement of the surviving fraction.</w:t>
+        <w:t>. A single cut on the starting density alone reproduces all eighteen (Table 2): once a reading is censored at the floor, the starting density fixes which label the published rule is able to return.</w:t>
       </w:r>
     </w:p>
     <w:p>
@@ -1502,7 +1502,7 @@
     </w:p>
     <w:p>
       <w:r>
-        <w:t>Sections 1 and 2 counted isolates. The two boundaries derived in the Methods do more than that. Given only the floor, the class thresholds and each isolate's starting density, they say in advance which isolates are affected, before any day-5 reading is used.</w:t>
+        <w:t>Sections 1 and 2 counted isolates. The two boundaries derived in the Methods do more: given only the floor, the class thresholds and each isolate's starting density, they say in advance which isolates are affected, before any day-5 reading is used.</w:t>
       </w:r>
     </w:p>
     <w:p>
@@ -1516,7 +1516,7 @@
         <w:t>N</w:t>
       </w:r>
       <w:r>
-        <w:t xml:space="preserve">_reach = 23 × 10⁴ = 230 000 per mL and </w:t>
+        <w:t xml:space="preserve">_reach = 23 × 10⁴ = 230,000 per mL and </w:t>
       </w:r>
       <w:r>
         <w:rPr>
@@ -1525,12 +1525,12 @@
         <w:t>N</w:t>
       </w:r>
       <w:r>
-        <w:t>_id = 23/10⁻³ = 23 000 per mL. Applied to the 15-day panel, the first predicts 33 isolates unable to reach the 99.99 per cent endpoint. The second predicts that of the eighteen isolates whose reading rests on the floor, twelve have only the lowest class compatible with that reading and six have more than one. Those are the three counts Sections 1 and 2 report.</w:t>
+        <w:t>_id = 23/10⁻³ = 23,000 per mL. Applied to the 15-day panel, the first predicts the 33 isolates unable to reach the 99.99 per cent endpoint; the second predicts that of the eighteen isolates whose reading rests on the floor, twelve have only the lowest class compatible and six have more than one. Those are the three counts Sections 1 and 2 report.</w:t>
       </w:r>
     </w:p>
     <w:p>
       <w:r>
-        <w:t>Neither boundary predicts which isolates reach the floor; that depends on what rifampicin does. Both predict what a reading at the floor can be made to mean once it happens, and there the agreement with the deposit is exact isolate by isolate: the set the algebra says has a single compatible class and the set the deposit records in the lowest class are the same set.</w:t>
+        <w:t>Neither boundary predicts which isolates reach the floor; that depends on what rifampicin does. Both predict what a reading at the floor can be made to mean once it happens, and there the agreement with the deposit is exact, isolate by isolate: the set the algebra says has a single compatible class and the set the deposit records in the lowest class are the same set.</w:t>
       </w:r>
     </w:p>
     <w:p>
@@ -1558,7 +1558,7 @@
     </w:p>
     <w:p>
       <w:r>
-        <w:t xml:space="preserve">What is sharp is the boundary case, and it is the part of this section that discriminates. Six isolates sit at exactly 23 000 per mL, which is </w:t>
+        <w:t xml:space="preserve">What is sharp is the boundary case. Six isolates sit at exactly 23,000 per mL, which is </w:t>
       </w:r>
       <w:r>
         <w:rPr>
@@ -1617,7 +1617,7 @@
     </w:p>
     <w:p>
       <w:r>
-        <w:t>The empirical findings are therefore consequences of the definitions rather than properties of this deposit, and the claim is a prediction that any dataset reporting a starting density, a floor and a threshold classification can be checked against.</w:t>
+        <w:t>The empirical findings are therefore consequences of the definitions rather than properties of this deposit: any dataset reporting a starting density, a floor and a threshold classification can be checked against them.</w:t>
       </w:r>
     </w:p>
     <w:p>
@@ -1629,59 +1629,45 @@
           <w:b/>
           <w:sz w:val="22"/>
         </w:rPr>
-        <w:t>4. What the plate misses is not only what lies below its floor</w:t>
+        <w:t>4. The label tracks how fast an isolate grows, and its link to resistance cannot be separated from the inoculum</w:t>
       </w:r>
     </w:p>
     <w:p>
       <w:r>
-        <w:t>Everything above is about the floor. One published observation in this organism shows that the floor is not the only reason a colony count understates the population, and it is set out here because the two failures are easy to confuse and must not be.</w:t>
+        <w:t>There are two candidate predictors of the deposited label, each tested at two culture ages and two endpoint depths, eight tests in all. Eight tests on one question will throw up a false positive on their own, so they are corrected together as one family. Two survive (Table S4).</w:t>
       </w:r>
     </w:p>
     <w:p>
       <w:r>
-        <w:t>Evangelopoulos and colleagues counted the same mouse lungs three ways: colony count, a molecular bacterial load from 16S rRNA, and a most probable number, on their way to a different question (7). Under the deepest regimens the colony count reads zero in every animal. In three arms, 18 lungs in all, the plate declared every lung sterile while the most probable number on that same tissue ran from 1 450 to 18 700 per lung. The molecular load can be dismissed as nucleic acid outliving its owner. The most probable number cannot, because it is a culture, and growth in a dilution series requires an organism that is alive and culturable.</w:t>
-      </w:r>
-    </w:p>
-    <w:p>
-      <w:r>
-        <w:t xml:space="preserve">That gap is not the detection floor, and the arithmetic says so. Neither assay's floor is reported in the deposit, but for censoring to explain a plate reading of zero against 1 450 organisms in the same tissue, the colony count's floor would have to sit above 1 450 per lung, which would mean plating a vanishingly small fraction of the homogenate, far less than any lung protocol plates. The organisms were there, they were alive, they grew in a liquid dilution series, and they did not form colonies on solid medium. That is differential culturability, not censoring. It is a described phenotype of </w:t>
-      </w:r>
-      <w:r>
-        <w:rPr>
-          <w:i/>
-        </w:rPr>
-        <w:t>M. tuberculosis</w:t>
-      </w:r>
-      <w:r>
-        <w:t xml:space="preserve"> with a literature of its own: bacilli that require resuscitation-promoting factors to grow dominate pre-treatment sputum and rise as a proportion of the population during chemotherapy (8), both resuscitation-promoting-factor-dependent and -independent differentially culturable populations are recovered from patients whose solid-medium cultures return nothing (9), and the mechanism has been reproduced experimentally: rifamycin action on RNA polymerase, independent of any assay's floor, converts a starved population to over 90 per cent differentially detectable in vitro (10); the same drug class every arm of the Evangelopoulos regimen carries.</w:t>
-      </w:r>
-    </w:p>
-    <w:p>
-      <w:r>
-        <w:t>Keeping the two apart matters for what this paper claims. Reachability and identifiability are arithmetic on the plated volume; they hold whether or not every viable organism forms a colony, and they would hold in an assay with perfect culturability. Differential culturability is biology, it acts on the numerator rather than on the floor, and nothing in this paper derives it or measures it. Neither depends on the other, and they push the same way: a count that is both floored and culture-selective understates the surviving population twice over, and a log-reduction endpoint read off that count inherits the pair of them. The mouse model that decides which regimens enter clinical trials reads out in colony counts, and this is the region it reads them in.</w:t>
-      </w:r>
-    </w:p>
-    <w:p>
-      <w:r>
-        <w:t xml:space="preserve">Back to the floor itself, and to what it costs. That deposit establishes no floor of its own. Five further </w:t>
-      </w:r>
-      <w:r>
-        <w:rPr>
-          <w:i/>
-        </w:rPr>
-        <w:t>M. tuberculosis</w:t>
-      </w:r>
-      <w:r>
-        <w:t xml:space="preserve"> deposits in the same screen do, and they are not reassuring. Across those five, sputum from pulmonary tuberculosis, axenic culture, an auxotrophic H37Rv panel and two drug-development series, with floors from 13 to 200 CFU/mL, </w:t>
+        <w:t xml:space="preserve">The label tracks the </w:t>
       </w:r>
       <w:r>
         <w:rPr>
           <w:b/>
         </w:rPr>
-        <w:t>184 of 310 series could not have demonstrated a four-log reduction however completely the drug worked, and 240 of 310 could not have demonstrated five</w:t>
-      </w:r>
-      <w:r>
-        <w:t xml:space="preserve"> (Table S4). One of the five could not have shown four logs in a single one of its 123 series. None of these five carries the analysis above, and none is among the five deposits reanalysed in this paper; they are what the same screen found in the same organism, and they say the reachability problem is not a property of one clinical panel.</w:t>
+        <w:t>growth rate</w:t>
+      </w:r>
+      <w:r>
+        <w:t xml:space="preserve"> of the isolate. Slower growth goes with a higher tolerance class, and it survives adjustment for starting density (OR 1.096 per day of time to OD 0.4, 95 per cent CI 1.032 to 1.164, p = 0.0030, n = 202; unadjusted OR 1.126, 1.062 to 1.193). The label also tracks </w:t>
+      </w:r>
+      <w:r>
+        <w:rPr>
+          <w:b/>
+        </w:rPr>
+        <w:t>isoniazid resistance</w:t>
+      </w:r>
+      <w:r>
+        <w:t>, until starting density enters the model. Unadjusted, a resistant isolate has 2.32 times the odds of a higher tolerance class (1.30 to 4.12, p = 0.0042); adjusted, the odds ratio falls to 1.31 (0.67 to 2.57, p = 0.42), and the interval no longer excludes one. The unadjusted 2.32 is the total effect of resistance on the label; the adjusted 1.31 is the controlled direct effect with the inoculum held fixed, under an assumption this deposit cannot test on its own, that starting density sits on the causal path as a mediator rather than beside it as a confounder. The reverse reading is equally available a priori: if slow growth both thins the inoculum and causes genuine tolerance, adjusting for starting density would remove real signal rather than a confounder (Discussion weighs the two readings against each other). What is not in question, whichever reading is right, is that the association weakens once starting density enters the model. Starting density is the strongest term in the file: every ten-fold rise in the starting MPN halves the odds of a higher tolerance class (OR 0.480, 0.340 to 0.677, p = 2.9 × 10⁻⁵).</w:t>
+      </w:r>
+    </w:p>
+    <w:p>
+      <w:r>
+        <w:t>Why the adjustment does that is measurable. Isoniazid-resistant isolates go into this assay at 5.36 log10 against 6.36 for susceptible isolates, ten-fold thinner (Mann-Whitney p = 9.1 × 10⁻¹⁴ (7)), and 22 of the 84 resistant isolates carrying an ordered label lack the headroom for the deepest endpoint, 26.2 per cent, against 9 of 119 susceptible, 7.6 per cent. They are one log short of observable killing before the experiment begins.</w:t>
+      </w:r>
+    </w:p>
+    <w:p>
+      <w:r>
+        <w:t>In that stratum the two associations part company. Growth holds and still survives correction (OR 1.116, 1.040 to 1.198, p = 0.0024). Resistance returns OR 2.11 (1.07 to 4.16, p = 0.031) nominally, but ranks second in the family of eight and fails its Benjamini-Hochberg critical value of 0.0125. The resistance association therefore leans on isolates that are not independent of one another, and it is already the association that starting density explains away; we report it as the weaker of the two on both counts.</w:t>
       </w:r>
     </w:p>
     <w:p>
@@ -1693,45 +1679,22 @@
           <w:b/>
           <w:sz w:val="22"/>
         </w:rPr>
-        <w:t>5. The label tracks how fast an isolate grows, and its link to resistance cannot be separated from the inoculum</w:t>
+        <w:t>5. One written protocol does not give every laboratory the same depth to look down</w:t>
       </w:r>
     </w:p>
     <w:p>
       <w:r>
-        <w:t>We asked what the deposited tolerance label goes with. There are two candidate predictors, and each is tested at two culture ages and at two endpoint depths, which is eight tests in all. Eight tests on one question will throw up a false positive on their own, so we correct them together as one family. Two survive (Table S5).</w:t>
+        <w:t>If the effect is a property of assay geometry rather than of clinical sampling, it should appear where one protocol, one strain and one stock are handed out deliberately. Van Wijk and colleagues (2023) ran exactly that exercise, sending a single stock of H37Rv to six blinded laboratories under one written protocol (8, 9). It does.</w:t>
       </w:r>
     </w:p>
     <w:p>
       <w:r>
-        <w:t xml:space="preserve">The label tracks the </w:t>
-      </w:r>
-      <w:r>
-        <w:rPr>
-          <w:b/>
-        </w:rPr>
-        <w:t>growth rate</w:t>
-      </w:r>
-      <w:r>
-        <w:t xml:space="preserve"> of the isolate. Slower growth goes with a higher tolerance class, and it survives adjustment for starting density (OR 1.096 per day of time to OD 0.4, 95 per cent CI 1.032 to 1.164, p = 0.0030, n = 202; unadjusted OR 1.126, 1.062 to 1.193). The label also tracks </w:t>
-      </w:r>
-      <w:r>
-        <w:rPr>
-          <w:b/>
-        </w:rPr>
-        <w:t>isoniazid resistance</w:t>
-      </w:r>
-      <w:r>
-        <w:t>, until the starting density enters the model. On its own, a resistant isolate has 2.32 times the odds of a higher tolerance class (95 per cent CI 1.30 to 4.12, p = 0.0042). Adjusted for starting density the odds ratio falls to 1.31 (0.67 to 2.57, p = 0.42), and the interval no longer excludes one. The two figures estimate different things: the unadjusted 2.32 is the total effect of resistance on the label, and the adjusted 1.31 is the controlled direct effect with the inoculum held fixed under an assumption this deposit cannot test on its own: that starting density sits on the causal path as a mediator here rather than beside it as a confounder. The reverse reading is equally available a priori: if slow growth both thins the inoculum and causes genuine tolerance, adjusting for starting density would remove real signal rather than a confounder, not attenuate a spurious one (Discussion weighs the two readings against each other). The mediation decomposition under the mediator reading is Table S6. What is not in question, whichever reading is right, is that the association weakens once starting density enters the model: 185 of the 203 calls still rest on a measured, uncensored numerator. Starting density is the strongest term in the file: every ten-fold rise in the starting most probable number halves the odds of a higher tolerance class (OR 0.480, 0.340 to 0.677, p = 2.9 × 10⁻⁵).</w:t>
+        <w:t>At ten times the minimum inhibitory concentration of moxifloxacin all six laboratories return a positive kill rate, spanning 5.2-fold, from 0.090 to 0.464 log10 CFU/mL per day. Across all 30 laboratory-by-arm cells the Tobit estimate and the imputation estimate never differ by more than 0.006 log10 per day (Fig. 2A, Table S5), which says the fit is not an artefact of the arithmetic used to reach it, not that the sub-floor assumption is safe: both estimators assume the same normal distribution below the floor, and nothing here can check that from the inside.</w:t>
       </w:r>
     </w:p>
     <w:p>
       <w:r>
-        <w:t>Why the adjustment does that is measurable. Isoniazid-resistant isolates go into this assay at 5.36 log10 against 6.36 for susceptible isolates, ten-fold thinner (Mann–Whitney p = 9.1 × 10⁻¹⁴) (11), and 22 of the 84 resistant isolates carrying an ordered label lack the headroom for the deepest endpoint, 26.2 per cent, against 9 of the 119 susceptible, 7.6 per cent. Those two counts are the 31 of Section 1, which is that section's 33 less the two isolates whose label is the unordered fourth category. They are one log short of observable killing before the experiment begins.</w:t>
-      </w:r>
-    </w:p>
-    <w:p>
-      <w:r>
-        <w:t>In that stratum the two surviving associations part company. Growth holds and still survives correction (OR 1.116, 1.040 to 1.198, p = 0.0024). Resistance returns OR 2.11 (1.07 to 4.16, p = 0.031) nominally, but ranks second in the family of eight and fails its Benjamini–Hochberg critical value of 0.0125. The resistance association therefore leans on isolates that are not independent of one another, and it is already the association that starting density explains away. We report it as the weaker of the two on both counts.</w:t>
+        <w:t>The two orderings do not correspond. Rank the laboratories by starting density and the three lowest are exactly the three that recorded crossings, the three highest exactly the three that did not, without exception, a split with probability 1/20 under chance alone, reported as an ordering and not a test (Table S6). Rank them by kill rate and there is no such correspondence (Fig. 2B). Institute F has the highest starting density at 6.53 log10 among treated flasks of this arm, kills faster than four of the other five at 0.223 log10 per day, and records no crossing. Institute E returns the slowest rate of all at 0.090 and also records none.</w:t>
       </w:r>
     </w:p>
     <w:p>
@@ -1743,22 +1706,72 @@
           <w:b/>
           <w:sz w:val="22"/>
         </w:rPr>
-        <w:t>6. One written protocol does not give every laboratory the same depth to look down</w:t>
+        <w:t>6. The same boundaries hold in an experiment the framework never saw</w:t>
       </w:r>
     </w:p>
     <w:p>
       <w:r>
-        <w:t>If the effect is a property of assay geometry rather than of clinical sampling, it should appear where one protocol, one strain and one stock are handed out deliberately. Van Wijk and colleagues (2023) ran exactly that exercise, sending a single stock of H37Rv to six blinded laboratories under one written protocol (12, 13). It does.</w:t>
+        <w:t xml:space="preserve">Only one deposit was opened after every boundary and threshold was fixed. That it is </w:t>
+      </w:r>
+      <w:r>
+        <w:rPr>
+          <w:i/>
+        </w:rPr>
+        <w:t>E. coli</w:t>
+      </w:r>
+      <w:r>
+        <w:t xml:space="preserve"> in a hollow-fibre system rather than </w:t>
+      </w:r>
+      <w:r>
+        <w:rPr>
+          <w:i/>
+        </w:rPr>
+        <w:t>M. tuberculosis</w:t>
+      </w:r>
+      <w:r>
+        <w:t xml:space="preserve"> in a flask makes it a harder test, not a softer one: a rule fitted to tuberculosis time-kill data could be expected to fit more of it; what it has no right to survive is a different organism, drug class and apparatus. The boundaries are derived from definitions, so they predict they will.</w:t>
       </w:r>
     </w:p>
     <w:p>
       <w:r>
-        <w:t>At ten times the minimum inhibitory concentration of moxifloxacin all six laboratories return a positive kill rate, and the rates span 5.2-fold, from 0.090 to 0.464 log10 CFU/mL per day. Across all 30 laboratory-by-arm cells the Tobit estimate (a fit that treats a below-floor reading as below the floor rather than as a number) and the imputation estimate never differ by more than 0.006 log10 per day (Fig. 2A, Table S7). That agreement says the fit is not an artefact of the arithmetic used to reach it. It does not say the sub-floor assumption is safe: both estimators assume the same normal distribution below the floor, and nothing in this deposit can check that assumption from the inside.</w:t>
+        <w:t xml:space="preserve">Dubey and colleagues (2026) report amoxicillin-clavulanate against </w:t>
+      </w:r>
+      <w:r>
+        <w:rPr>
+          <w:i/>
+        </w:rPr>
+        <w:t>Escherichia coli</w:t>
+      </w:r>
+      <w:r>
+        <w:t xml:space="preserve"> in a hollow-fibre system (10, 11). Their Methods state 100 µL plated with counts per mL, so </w:t>
+      </w:r>
+      <w:r>
+        <w:rPr>
+          <w:i/>
+        </w:rPr>
+        <w:t>L</w:t>
+      </w:r>
+      <w:r>
+        <w:t xml:space="preserve"> = 10 CFU/mL is derived rather than inferred, and the file corroborates the derivation: all 229 genuine counts are multiples of ten, the smallest exactly ten, while 69 further entries read as one, which no 100 µL plate can produce and which are the deposit's placeholder for below the floor.</w:t>
       </w:r>
     </w:p>
     <w:p>
       <w:r>
-        <w:t>The two orderings do not correspond. Rank the laboratories by starting density and the three lowest are exactly the three that recorded crossings, the three highest exactly the three that did not, without exception, a split with probability 1/20 under chance alone, so it is reported as an ordering and not a test (Table S8). Rank them by kill rate and there is no such correspondence (Fig. 2B). Institute F has the highest starting density at 6.53 log10 among the treated flasks of this arm, kills faster than four of the other five at 0.223 log10 per day, and records no crossing. Institute E returns the slowest rate of all at 0.090 and also records none.</w:t>
+        <w:t>Across the 20 cultures with a measured day-zero density, headroom runs from 4.85 to 5.45 log10 (Table S7). Endpoints at 1, 2, 3 and 4 logs are reachable for every culture; a 5-log endpoint is unreachable for 5 of 20, a 6-log endpoint for all 20. On data it was not built from, the framework locates the depth at which a sterilisation claim stops being demonstrable.</w:t>
+      </w:r>
+    </w:p>
+    <w:p>
+      <w:r>
+        <w:t xml:space="preserve">Two features of that deposit are the failure modes this framework is meant to catch. Its Methods give a nominal inoculum of 10⁵ CFU/mL while the file measures a median of 1.215 × 10⁶, so taking </w:t>
+      </w:r>
+      <w:r>
+        <w:rPr>
+          <w:i/>
+        </w:rPr>
+        <w:t>N₀</w:t>
+      </w:r>
+      <w:r>
+        <w:t xml:space="preserve"> from the Methods rather than the data would have placed a full order of magnitude into every boundary. And its treated arm reads at or below the floor already at day zero while the paired control reads about 10⁶; the file cannot distinguish a sample drawn after exposure from a placeholder or a transcription error, so the reading is flagged rather than treated as a measured time zero.</w:t>
       </w:r>
     </w:p>
     <w:p>
@@ -1770,40 +1783,22 @@
           <w:b/>
           <w:sz w:val="22"/>
         </w:rPr>
-        <w:t>7. The same boundaries hold in an experiment the framework never saw</w:t>
+        <w:t>7. What the plate misses is not only what lies below its floor</w:t>
       </w:r>
     </w:p>
     <w:p>
       <w:r>
-        <w:t xml:space="preserve">Every section so far tests the framework on the deposits it was built from, and all of them are </w:t>
-      </w:r>
-      <w:r>
-        <w:rPr>
-          <w:i/>
-        </w:rPr>
-        <w:t>Mycobacterium tuberculosis</w:t>
-      </w:r>
-      <w:r>
-        <w:t>. A search of five general repositories, the tuberculosis consortia, the persistence literature, food microbiology and the hollow-fibre field returned one deposit that carried all three fields the boundaries require and could be analysed cold. That is a statement about what that search returned, not about what exists.</w:t>
+        <w:t>Everything above is about the floor. One published observation in this organism shows that the floor is not the only reason a colony count understates the population, and the two failures must not be confused.</w:t>
       </w:r>
     </w:p>
     <w:p>
       <w:r>
-        <w:t>The point of this section is a deposit opened after every boundary and threshold was fixed, and only one deposit qualifies on that ground.</w:t>
+        <w:t>Evangelopoulos and colleagues counted the same mouse lungs three ways, colony count, a molecular bacterial load from 16S rRNA, and a most probable number, on their way to a different question (12). Under the deepest regimens the colony count reads zero in every animal: in three arms, 18 lungs in all, the plate declared every lung sterile while the most probable number on that same tissue ran from 1,450 to 18,700 per lung. The molecular load can be dismissed as nucleic acid outliving its owner; the most probable number cannot, because it is a culture, and growth in a dilution series requires an organism that is alive and culturable.</w:t>
       </w:r>
     </w:p>
     <w:p>
       <w:r>
-        <w:t xml:space="preserve">That it is </w:t>
-      </w:r>
-      <w:r>
-        <w:rPr>
-          <w:i/>
-        </w:rPr>
-        <w:t>E. coli</w:t>
-      </w:r>
-      <w:r>
-        <w:t xml:space="preserve"> in a hollow-fibre system rather than </w:t>
+        <w:t xml:space="preserve">That gap is not the detection floor, and the arithmetic says so. For censoring to explain a plate reading of zero against 1,450 organisms in the same tissue, the colony count's floor would have to sit above 1,450 per lung, far less of the homogenate than any lung protocol plates. This is differential culturability, a described phenotype of </w:t>
       </w:r>
       <w:r>
         <w:rPr>
@@ -1812,49 +1807,35 @@
         <w:t>M. tuberculosis</w:t>
       </w:r>
       <w:r>
-        <w:t xml:space="preserve"> in a flask makes it a harder test and not a softer one. A rule fitted to tuberculosis time-kill data could be expected to fit more tuberculosis time-kill data; what it has no right to survive is a different organism, a different drug class and a different apparatus. The boundaries are derived from definitions, so they predict they will survive exactly that, and this is where that prediction was put at risk.</w:t>
+        <w:t xml:space="preserve"> with a literature of its own: resuscitation-promoting-factor-dependent bacilli dominate pre-treatment sputum and rise during chemotherapy (13), both dependent and independent differentially culturable populations are recovered from patients whose solid-medium cultures return nothing (14), and the mechanism has been reproduced experimentally, rifamycin action on ribonucleic acid (RNA) polymerase converting a starved population to over 90 per cent differentially detectable in vitro (15), the same drug class every arm of the Evangelopoulos regimen carries.</w:t>
       </w:r>
     </w:p>
     <w:p>
       <w:r>
-        <w:t xml:space="preserve">Dubey and colleagues (2026) report amoxicillin-clavulanate against </w:t>
+        <w:t>Reachability and identifiability are arithmetic on the plated volume; they would hold in an assay with perfect culturability. Differential culturability is biology, acts on the numerator rather than the floor, and nothing here derives or measures it. Neither depends on the other, and they push the same way: a count that is both floored and culture-selective understates the surviving population twice over, and the mouse model that decides which regimens enter clinical trials reads out in colony counts, in exactly this region.</w:t>
+      </w:r>
+    </w:p>
+    <w:p>
+      <w:r>
+        <w:t xml:space="preserve">That deposit establishes no floor of its own. Five further </w:t>
       </w:r>
       <w:r>
         <w:rPr>
           <w:i/>
         </w:rPr>
-        <w:t>Escherichia coli</w:t>
-      </w:r>
-      <w:r>
-        <w:t xml:space="preserve"> in a hollow-fibre system (14, 15). Their Methods state 100 µL plated with counts per mL, so </w:t>
+        <w:t>M. tuberculosis</w:t>
+      </w:r>
+      <w:r>
+        <w:t xml:space="preserve"> deposits in the same screen do, and they are not reassuring. Across those five, sputum from pulmonary tuberculosis, axenic culture, an auxotrophic H37Rv panel and two drug-development series, with floors from 13 to 200 CFU/mL, </w:t>
       </w:r>
       <w:r>
         <w:rPr>
-          <w:i/>
+          <w:b/>
         </w:rPr>
-        <w:t>L</w:t>
-      </w:r>
-      <w:r>
-        <w:t xml:space="preserve"> = 10 CFU/mL is derived rather than inferred, and the file corroborates the derivation: a 100 µL plate reporting per mL can return only multiples of ten, and all 229 genuine counts in the deposit are multiples of ten, the smallest exactly ten. Sixty-nine further entries read as one, which no 100 µL plate can produce; they are the deposit's placeholder for below the floor.</w:t>
-      </w:r>
-    </w:p>
-    <w:p>
-      <w:r>
-        <w:t>Across the 20 cultures with a measured day-zero density, headroom runs from 4.85 to 5.45 log10. Endpoints at 1, 2, 3 and 4 logs are reachable for every culture. A 5-log endpoint is unreachable for 5 of 20. A 6-log endpoint is unreachable for all 20 (Table S9). On data it was not built from, the framework therefore locates the depth at which a sterilisation claim in this experiment stops being demonstrable.</w:t>
-      </w:r>
-    </w:p>
-    <w:p>
-      <w:r>
-        <w:t xml:space="preserve">Two features of that deposit are worth recording because they are the failure modes this framework is meant to catch. Its Methods give a nominal inoculum of 10⁵ CFU/mL while the file measures a median of 1.215 × 10⁶, so taking </w:t>
-      </w:r>
-      <w:r>
-        <w:rPr>
-          <w:i/>
-        </w:rPr>
-        <w:t>N₀</w:t>
-      </w:r>
-      <w:r>
-        <w:t xml:space="preserve"> from the Methods rather than from the data would have placed a full order of magnitude into every boundary. And its treated arm reads at or below the floor already at day zero while the paired control reads about 10⁶. Either that sample was drawn after exposure rather than before it, or the day-zero value is a placeholder or a transcription error; the file cannot distinguish the two, and we flag the reading rather than treat it as a measured time zero.</w:t>
+        <w:t>184 of 310 series could not have demonstrated a four-log reduction however completely the drug worked, and 240 of 310 could not have demonstrated five</w:t>
+      </w:r>
+      <w:r>
+        <w:t xml:space="preserve"> (Table S8); one could not have shown four logs in a single one of its 123 series. None of these five carries the analysis above, and none is among the five deposits reanalysed in this paper; they say the reachability problem is not a property of one clinical panel.</w:t>
       </w:r>
     </w:p>
     <w:p>
@@ -1889,7 +1870,7 @@
         <w:t>N</w:t>
       </w:r>
       <w:r>
-        <w:t xml:space="preserve">_id (the starting densities that decide whether an endpoint is reachable and a label means anything), with its predictions written down before a plate was counted. </w:t>
+        <w:t xml:space="preserve">_id, with its predictions written down before a plate was counted. </w:t>
       </w:r>
       <w:r>
         <w:rPr>
@@ -1898,7 +1879,7 @@
         <w:t>Escherichia coli</w:t>
       </w:r>
       <w:r>
-        <w:t xml:space="preserve"> ATCC 25922, of the American Type Culture Collection (the reference strain the standard names for quality control), against ciprofloxacin at ten times the concentration that stops it growing. Three seeding densities, two plated volumes, three flasks each, 216 plate readings.</w:t>
+        <w:t xml:space="preserve"> ATCC 25922, the reference strain the standard names for quality control, against ciprofloxacin at ten times the concentration that stops it growing. Three seeding densities, two plated volumes, three flasks each, 216 plate readings.</w:t>
       </w:r>
     </w:p>
     <w:p>
@@ -1921,7 +1902,7 @@
         <w:t>M. tuberculosis</w:t>
       </w:r>
       <w:r>
-        <w:t xml:space="preserve">, and that is a design choice rather than a convenience. Reachability and identifiability are arithmetic on a plated volume, so they do not know what organism is on the plate; what an organism decides is whether the experiment can be run at all. Three seeding densities crossed with two plated volumes and six sampling times is 216 plates that must be counted from one exposure, and in </w:t>
+        <w:t xml:space="preserve"> by design, not convenience. Reachability and identifiability are arithmetic on a plated volume, so they do not know what organism is on the plate; what an organism decides is whether the experiment can be run at all. Three seeding densities crossed with two plated volumes and six sampling times is 216 plates that must be counted from one exposure, and in </w:t>
       </w:r>
       <w:r>
         <w:rPr>
@@ -1939,12 +1920,12 @@
         <w:t>E. coli</w:t>
       </w:r>
       <w:r>
-        <w:t xml:space="preserve"> to the floor within a working day, which is what makes the floor reachable in every arm and the prediction falsifiable in a week rather than a year. ATCC 25922 is not a substitute chosen for ease either: it is the quality-control reference strain the standard itself names, so the demonstration runs in the one organism whose assay geometry the standard defines.</w:t>
+        <w:t xml:space="preserve"> to the floor within a working day, which makes the floor reachable in every arm and the prediction falsifiable in a week rather than a year. ATCC 25922 is the quality-control reference strain the standard itself names, so the demonstration runs in the one organism whose assay geometry the standard defines.</w:t>
       </w:r>
     </w:p>
     <w:p>
       <w:r>
-        <w:t xml:space="preserve">The middle arm was seeded on purpose at the 5 × 10⁵ per mL the standard specifies. The densities actually reached were 6.4 × 10⁴, 4.4 × 10⁵ and 3.8 × 10⁶ per mL, quoted as arm means. Those three figures are means, and every figure after them is per flask. The distinction is not cosmetic: </w:t>
+        <w:t xml:space="preserve">The middle arm was seeded on purpose at the 5 × 10⁵ per mL the standard specifies. The densities actually reached were 6.4 × 10⁴, 4.4 × 10⁵ and 3.8 × 10⁶ per mL as arm means, but </w:t>
       </w:r>
       <w:r>
         <w:rPr>
@@ -1953,21 +1934,21 @@
         <w:t>N</w:t>
       </w:r>
       <w:r>
-        <w:t xml:space="preserve">₀ is not a setting the protocol supplies but a measurement made once per culture, so headroom belongs to a flask rather than to an arm. At the 100 µL plating the low arm's three flasks have 4.19, 4.11 and 4.00 logs of headroom, the last of them exactly at the four-log endpoint. Everything below is therefore reported per flask. </w:t>
+        <w:t xml:space="preserve">₀ is a measurement made once per culture rather than a setting the protocol supplies, so headroom belongs to a flask and everything below is reported per flask. At the 100 µL plating the low arm's three flasks have 4.19, 4.11 and 4.00 logs of headroom, the last exactly at the four-log endpoint. </w:t>
       </w:r>
       <w:r>
         <w:rPr>
           <w:b/>
         </w:rPr>
-        <w:t>At the standard inoculum plated at 10 µL, the deepest reduction the three flasks could report ran from 3.71 to 3.93 logs (each flask's own ceiling, not the drug's),</w:t>
-      </w:r>
-      <w:r>
-        <w:t xml:space="preserve"> while those same three cultures plated at 100 µL ran from 4.88 to 5.05 (Fig. S5B, Table S10). Every flask is paired with itself across the two platings, so the comparison is within a culture rather than between cultures.</w:t>
+        <w:t>At the standard inoculum plated at 10 µL, the deepest reduction the three flasks could report ran from 3.71 to 3.93 logs</w:t>
+      </w:r>
+      <w:r>
+        <w:t>, while those same three cultures plated at 100 µL ran from 4.88 to 5.05 (Fig. S5B, Table S9). Every flask is paired with itself across the two platings.</w:t>
       </w:r>
     </w:p>
     <w:p>
       <w:r>
-        <w:t xml:space="preserve">That much is arithmetic, as Box 1 says. So is the next step. When both platings of one sample rest on their own floors, the two fractions written down are </w:t>
+        <w:t xml:space="preserve">That much is arithmetic. So is the next step. When both platings of one sample rest on their own floors, the two fractions written down are </w:t>
       </w:r>
       <w:r>
         <w:rPr>
@@ -2003,7 +1984,7 @@
         <w:t>N</w:t>
       </w:r>
       <w:r>
-        <w:t xml:space="preserve">₀ (two different floors over one starting density), so they can fall either side of a class threshold and give one culture two labels. </w:t>
+        <w:t xml:space="preserve">₀, so they can fall either side of a class threshold and give one culture two labels. </w:t>
       </w:r>
       <w:r>
         <w:rPr>
@@ -2012,7 +1993,16 @@
         <w:t>The quantity that could have come out zero is how often a real experiment lands in the window where those two fractions straddle the cut</w:t>
       </w:r>
       <w:r>
-        <w:t>, and it depends on where the cut is (Fig. S5C, Table S11). Put the cut at one per cent and the window is nearly shut. Put it at one in a thousand, which is where the clinical classification analysed above cuts its lowest class, and six of 54 sample-times receive two different labels from one culture (one in nine). That cut is imported from the tuberculosis classification; nothing in the E. coli experiment derives it, and it serves here as a ruler for the window's width, not as a claim about E. coli biology.</w:t>
+        <w:t xml:space="preserve">, and it depends on where the cut is (Fig. S5C, Table S10). Put the cut at one per cent and the window is nearly shut. Put it at one in a thousand, where the clinical classification above cuts its lowest class, and six of 54 sample-times receive two different labels from one culture, one in nine. That cut is imported from the tuberculosis classification; it serves here as a ruler for the window's width, not a claim about </w:t>
+      </w:r>
+      <w:r>
+        <w:rPr>
+          <w:i/>
+        </w:rPr>
+        <w:t>E. coli</w:t>
+      </w:r>
+      <w:r>
+        <w:t xml:space="preserve"> biology.</w:t>
       </w:r>
     </w:p>
     <w:p>
@@ -2034,7 +2024,7 @@
     </w:p>
     <w:p>
       <w:r>
-        <w:t xml:space="preserve">The standard is not silent on that choice, and this is the paper's sharpest finding rather than an awkwardness for it. M26-A's own section 1.3.2.5, headed </w:t>
+        <w:t xml:space="preserve">The standard is not silent on that choice, and this is the paper's sharpest finding rather than an awkwardness for it. M26-A's own section 1.3.2.5, </w:t>
       </w:r>
       <w:r>
         <w:rPr>
@@ -2053,22 +2043,22 @@
     </w:p>
     <w:p>
       <w:r>
-        <w:t>That axis is the one tuberculosis drug development already leans on. Killing assays of this design rank regimens before they enter trials, and tolerance followed in patients is now being read as within-host evolution (19). If a tolerance classification is partly an inoculum measurement, conclusions drawn from it, that one regimen sterilises faster than another, or that a patient's isolates are becoming more tolerant over therapy, are in part conclusions about how the assay was set up. The correction applied here does not remove the biology; it aims it at the right target. The phenotype that survives the correction is growth state, which is real, targetable and directly measurable, unlike a fraction read off a floor.</w:t>
+        <w:t>That axis is the one tuberculosis drug development already leans on. Killing assays of this design rank regimens before they enter trials, and tolerance followed in patients is now being read as within-host evolution (19). If a tolerance classification is partly an inoculum measurement, conclusions drawn from it, that one regimen sterilises faster than another, or that a patient's isolates are becoming more tolerant over therapy, are in part conclusions about how the assay was set up. The correction applied here does not remove the biology; it aims it at the right target. The phenotype that survives the correction is growth state, real, targetable and directly measurable, unlike a fraction read off a floor.</w:t>
       </w:r>
     </w:p>
     <w:p>
       <w:r>
-        <w:t>The prospective experiment has a limitation of its own, and it is the one a reader of this paper should raise first. Its samples were diluted in saline and plated; they were not washed, filtered or treated to inactivate the drug, and no carryover control was run. Antibiotic carried onto the plate suppresses colony formation without killing anything, which is the same class of counting artefact this paper is about, and at the shallow dilutions a culture near its floor is read on, dilution is the only thing containing it. The design is conservative in this respect rather than clean: the larger plated volume carries ten times more drug to the plate, so carryover would shrink the very difference between the two platings that Section 8 reports. It would not manufacture it. But the experiment cannot exclude carryover, and a repetition should include the control that would.</w:t>
+        <w:t>The prospective experiment has a limitation of its own, and it is the one a reader of this paper should raise first. Its samples were diluted in saline and plated; they were not washed, filtered or treated to inactivate the drug, and no carryover control was run. Antibiotic carried onto the plate suppresses colony formation without killing anything, the same class of counting artefact this paper is about, and at the shallow dilutions a culture near its floor is read on, dilution is the only thing containing it. The design is conservative in this respect rather than clean: the larger plated volume carries ten times more drug to the plate, so carryover would shrink the very difference between the two platings that Section 8 reports, not manufacture it. But the experiment cannot exclude carryover, and a repetition should include the control that would.</w:t>
       </w:r>
     </w:p>
     <w:p>
       <w:r>
-        <w:t>Several limitations here bound what the analysis can establish; each points at the experiment that would settle the question, and the ones bearing on the claims made are given here, with the rest in the supplement.</w:t>
+        <w:t>Several further limitations bound what the analysis can establish; each points at the experiment that would settle the question, and the ones bearing on the claims made are given here, with the rest in the supplement.</w:t>
       </w:r>
     </w:p>
     <w:p>
       <w:r>
-        <w:t xml:space="preserve">This paper has already acted on the first rather than merely declaring it. Flasks from one laboratory share a starting culture; repeat isolates come from a patient already counted. Every conclusion from the two primary deposits was recomputed at the level where the observations really are independent, listed one line at a time rather than summarised (Table S8): twenty survive unchanged, six survive with much wider uncertainty, five do not survive and </w:t>
+        <w:t xml:space="preserve">This paper has already acted on the first rather than merely declaring it. Flasks from one laboratory share a starting culture; repeat isolates come from a patient already counted. Every conclusion from the two primary deposits was recomputed at the level where the observations really are independent, listed one line at a time rather than summarised (Table S6): twenty survive unchanged, six survive with much wider uncertainty, five do not survive and </w:t>
       </w:r>
       <w:r>
         <w:rPr>
@@ -2077,7 +2067,7 @@
         <w:t>have already been removed from the text above</w:t>
       </w:r>
       <w:r>
-        <w:t>, and one is withdrawn because the "no difference" it was tested against was already false before any data were seen. The ledger is printed so a reader can check the dropping was done rather than promised.</w:t>
+        <w:t>, and one is withdrawn because the null it was tested against was already false before any data were seen. The ledger is printed so a reader can check the dropping was done rather than promised.</w:t>
       </w:r>
     </w:p>
     <w:p>
@@ -2120,7 +2110,7 @@
         <w:t>c</w:t>
       </w:r>
       <w:r>
-        <w:t>₁) makes both failure modes impossible: the endpoint that was never reachable, and the last count that lands on the floor. For this assay that is 230 000 per mL. Seeding higher also changes the experiment, because a denser culture is a different physiological state, and physiological state is what the tolerance label tracks, so where the deep endpoint is wanted, lower the assay floor; where the headroom will not carry it either way, the shallower endpoint is the honest one, and growth state belongs on the report whichever is chosen. This is a design decision that is currently not being made.</w:t>
+        <w:t>₁) makes both failure modes impossible, the endpoint that was never reachable and the last count that lands on the floor; for this assay that is 230,000 per mL. Seeding higher also changes the experiment, because a denser culture is a different physiological state, and physiological state is what the tolerance label tracks, so where the deep endpoint is wanted, lower the assay floor instead; where the headroom will not carry it either way, the shallower endpoint is the honest one, and growth state belongs on the report whichever is chosen. This is a design decision that is currently not being made.</w:t>
       </w:r>
     </w:p>
     <w:p>
@@ -2781,7 +2771,7 @@
     </w:p>
     <w:p>
       <w:r>
-        <w:t xml:space="preserve">A time-kill guide already exists and this five-field minimum does not replace it: the ASTM International (American Society for Testing and Materials) guide E2315 sets out how to run and report a time-kill procedure in general (organism, media, neutralisation, raw counts) for antimicrobial products broadly, and none of its reporting requirements is </w:t>
+        <w:t xml:space="preserve">A time-kill guide already exists and this five-field minimum does not replace it: ASTM International (the American Society for Testing and Materials) guide E2315 sets out how to run and report a time-kill procedure in general (organism, media, neutralisation, raw counts) for antimicrobial products broadly, and none of its reporting requirements is </w:t>
       </w:r>
       <w:r>
         <w:rPr>
@@ -2835,7 +2825,7 @@
     </w:p>
     <w:p>
       <w:r>
-        <w:t>What this study adds is a way to see the problem before the plates are poured: two boundaries computed from quantities a time-kill protocol already records, a classification that refuses rather than guesses when the assay cannot decide (Table S12), a five-field minimum that makes any killing endpoint recomputable (Box 2), and a small tool that returns the endpoint a planned assay can support. None of it asks a laboratory for a new measurement; the cost is five numbers written down. The return is a tolerance phenotype that means the same in one laboratory as in the next, and that can bear the weight regimen research already puts on it.</w:t>
+        <w:t>What this study adds is a way to see the problem before the plates are poured: two boundaries computed from quantities a time-kill protocol already records, a classification that refuses rather than guesses when the assay cannot decide (Table S11), a five-field minimum that makes any killing endpoint recomputable (Box 2), and a small tool that returns the endpoint a planned assay can support. None of it asks a laboratory for a new measurement; the cost is five numbers written down. The return is a tolerance phenotype that means the same in one laboratory as in the next, and that can bear the weight regimen research already puts on it.</w:t>
       </w:r>
     </w:p>
     <w:p>
@@ -2926,7 +2916,7 @@
         <w:t>M. tuberculosis</w:t>
       </w:r>
       <w:r>
-        <w:t xml:space="preserve"> H37Rv from one stock, distributed with one written protocol to six blinded laboratories (van Wijk et al. 2023; figshare 19766083, CC BY 4.0) (12, 13). Moxifloxacin and isoniazid at one and ten times the minimum inhibitory concentration, three flasks per arm, each sample plated at four volumes: 100 µL quadruplicate, 10 µL as four drops, 10 µL as a single drop, and 2.5 µL as a single drop, giving three distinct floors spanning 1.60 log10 within a single flask-visit (22). The file holds 2,775 readings; the analysis set, after dropping unusable values and pre-treatment visits, is 2,580.</w:t>
+        <w:t xml:space="preserve"> H37Rv from one stock, distributed with one written protocol to six blinded laboratories (van Wijk et al. 2023; figshare 19766083, CC BY 4.0) (8, 9). Moxifloxacin and isoniazid at one and ten times the minimum inhibitory concentration, three flasks per arm, each sample plated at four volumes: 100 µL quadruplicate, 10 µL as four drops, 10 µL as a single drop, and 2.5 µL as a single drop, giving three distinct floors spanning 1.60 log10 within a single flask-visit (22). The file holds 2,775 readings; the analysis set, after dropping unusable values and pre-treatment visits, is 2,580.</w:t>
       </w:r>
     </w:p>
     <w:p>
@@ -2966,7 +2956,7 @@
         <w:t>M. tuberculosis</w:t>
       </w:r>
       <w:r>
-        <w:t xml:space="preserve"> at 128, 32, 8, 4 and 1 µg/mL, triplicate log10 CFU at days 0, 3, 7 and 14 (Kaur et al. 2024; figshare 26462791, CC BY 4.0) (25, 26). The 1 µg/mL arm shows net growth rather than killing and is excluded from the dose comparison, leaving 4 to 128 µg/mL as the range compared (Text S3).</w:t>
+        <w:t xml:space="preserve"> at 128, 32, 8, 4 and 1 µg/mL, triplicate log10 CFU at days 0, 3, 7 and 14 (Kaur et al. 2024; figshare 26462791, CC BY 4.0) (25, 26). The 1 µg/mL arm shows net growth rather than killing and is excluded from the dose comparison, leaving 4 to 128 µg/mL as the range compared (Section 6).</w:t>
       </w:r>
     </w:p>
     <w:p>
@@ -2989,7 +2979,7 @@
         <w:t>Escherichia coli</w:t>
       </w:r>
       <w:r>
-        <w:t xml:space="preserve"> in a hollow-fibre infection model, with 100 µL plated, measured day-zero densities for every culture, and below-limit readings retained as a placeholder (Dubey et al. 2026; article Source Data, CC BY 4.0) (14, 15). It was the only deposit found carrying all three fields the boundaries require, and no boundary, threshold or modelling choice in this paper was informed by it; it is used nowhere else in the paper except to confirm them (Section 7).</w:t>
+        <w:t xml:space="preserve"> in a hollow-fibre infection model, with 100 µL plated, measured day-zero densities for every culture, and below-limit readings retained as a placeholder (Dubey et al. 2026; article Source Data, CC BY 4.0) (10, 11). It was the only deposit found carrying all three fields the boundaries require, and no boundary, threshold or modelling choice in this paper was informed by it; it is used nowhere else in the paper except to confirm them (Text S3).</w:t>
       </w:r>
     </w:p>
     <w:p>
@@ -3209,7 +3199,7 @@
         <w:t>L</w:t>
       </w:r>
       <w:r>
-        <w:t xml:space="preserve"> is in each deposit is tabulated deposit by deposit (Table S13).</w:t>
+        <w:t xml:space="preserve"> is in each deposit is tabulated deposit by deposit (Table S12).</w:t>
       </w:r>
     </w:p>
     <w:p>
@@ -3223,7 +3213,7 @@
         <w:t>count below the assay floor</w:t>
       </w:r>
       <w:r>
-        <w:t xml:space="preserve"> is left-censored: the population is somewhere below a known value. In the clinical deposit the floor is inferred at 23 MPN/mL from three signatures: it is the smallest value in the file, nothing lies below it in 1,932 readings, and the minimum shifts by exactly a factor of ten per culture age; the conclusions drawn from it hold across the full range the deposit's own MPN table admits (Table S14). A </w:t>
+        <w:t xml:space="preserve"> is left-censored: the population is somewhere below a known value. In the clinical deposit the floor is inferred at 23 MPN/mL from three signatures: it is the smallest value in the file, nothing lies below it in 1,932 readings, and the minimum shifts by exactly a factor of ten per culture age; the conclusions drawn from it hold across the full range the deposit's own MPN table admits (Table S13). A </w:t>
       </w:r>
       <w:r>
         <w:rPr>
@@ -3246,7 +3236,7 @@
         <w:t>L</w:t>
       </w:r>
       <w:r>
-        <w:t>]; an MPN rung does not, since its likelihood extends well above the rung. Every identifiability verdict was therefore recomputed under the assay's own likelihood rather than the plate-sweep bound, confirming the same classification under both treatments (Table S15). Each below-limit flag in the six-laboratory deposit is judged against its own plated volume's floor rather than pooled to the least sensitive volume, since pooling would discard genuine quantified counts a more sensitive plating of the same sample recorded (Table S13 note).</w:t>
+        <w:t>]; an MPN rung does not, since its likelihood extends well above the rung. Every identifiability verdict was therefore recomputed under the assay's own likelihood rather than the plate-sweep bound, confirming the same classification under both treatments (Table S14). Each below-limit flag in the six-laboratory deposit is judged against its own plated volume's floor rather than pooled to the least sensitive volume, since pooling would discard genuine quantified counts a more sensitive plating of the same sample recorded (Table S12 note).</w:t>
       </w:r>
     </w:p>
     <w:p>
@@ -3260,7 +3250,7 @@
         <w:t>refused</w:t>
       </w:r>
       <w:r>
-        <w:t xml:space="preserve"> rather than reported (Table S16): the clinical deposit passes this rule at 0.40 log10 of support, and two of the five deposits fail it. This paper fits nothing to predict an MDK: once </w:t>
+        <w:t xml:space="preserve"> rather than reported (Table S15): the clinical deposit passes this rule at 0.40 log10 of support, and two of the five deposits fail it. This paper fits nothing to predict an MDK: once </w:t>
       </w:r>
       <w:r>
         <w:rPr>
@@ -3274,7 +3264,7 @@
     </w:p>
     <w:p>
       <w:r>
-        <w:t>The same likelihood turns classification into an inference with its own refusal rule: given a floor reading, the posterior over the true count maps through starting density to a posterior over class, and an isolate is refused when no class reaches 95 per cent confidence (Table S12). The refusal holds across both well designs, both floor readings and two priors.</w:t>
+        <w:t>The same likelihood turns classification into an inference with its own refusal rule: given a floor reading, the posterior over the true count maps through starting density to a posterior over class, and an isolate is refused when no class reaches 95 per cent confidence (Table S11). The refusal holds across both well designs, both floor readings and two priors.</w:t>
       </w:r>
     </w:p>
     <w:p>
@@ -3569,7 +3559,7 @@
         <w:t>The tolerance label</w:t>
       </w:r>
       <w:r>
-        <w:t xml:space="preserve"> was modelled as an ordered categorical outcome by proportional-odds ordinal logistic regression (32), with starting density as a prespecified covariate; proportional odds was tested by a Brant test per predictor (33) and a likelihood-ratio test against a generalised ordered logit (34), with the partial-proportional-odds fit reported where it fails and checked against a multinomial fit assuming no ordering (Table S17).</w:t>
+        <w:t xml:space="preserve"> was modelled as an ordered categorical outcome by proportional-odds ordinal logistic regression (32), with starting density as a prespecified covariate; proportional odds was tested by a Brant test per predictor (33) and a likelihood-ratio test against a generalised ordered logit (34), with the partial-proportional-odds fit reported where it fails and checked against a multinomial fit assuming no ordering (Table S16).</w:t>
       </w:r>
     </w:p>
     <w:p>
@@ -3622,7 +3612,7 @@
         <w:t>Denominators.</w:t>
       </w:r>
       <w:r>
-        <w:t xml:space="preserve"> A dozen denominators appear in this paper and each is derived in a single place (Table S2): the MDR tolerance label is dropped wherever an ordered outcome is fitted (14 rows per panel, 20 at 60 days), the growth proxy is missing for one isolate, and five of 72 treated flasks in the six-laboratory deposit carry no usable starting density. Dropped rows are compared with retained ones on starting density and susceptibility to test whether the exclusions are plausibly ignorable (Table S18).</w:t>
+        <w:t xml:space="preserve"> A dozen denominators appear in this paper and each is derived in a single place (Table S2): the MDR tolerance label is dropped wherever an ordered outcome is fitted (14 rows per panel, 20 at 60 days), the growth proxy is missing for one isolate, and five of 72 treated flasks in the six-laboratory deposit carry no usable starting density. Dropped rows are compared with retained ones on starting density and susceptibility to test whether the exclusions are plausibly ignorable (Table S17).</w:t>
       </w:r>
     </w:p>
     <w:p>
@@ -3893,12 +3883,12 @@
     </w:p>
     <w:p>
       <w:r>
-        <w:t>Every dataset analysed here was already public under an open licence. Each is identified in Table 3 and cited alongside the article that first described it: Vijay and colleagues (21, 51), van Wijk and colleagues (12, 13), Windels and colleagues (23, 24), Kaur and colleagues (25, 26), and the hollow-fibre Source Data of Dubey and colleagues (14, 15), held out of every fitting step. The readings from the prospective experiment are deposited with the analysis code.</w:t>
+        <w:t>Every dataset analysed here was already public under an open licence. Each is identified in Table 3 and cited alongside the article that first described it: Vijay and colleagues (21, 51), van Wijk and colleagues (8, 9), Windels and colleagues (23, 24), Kaur and colleagues (25, 26), and the hollow-fibre Source Data of Dubey and colleagues (10, 11), held out of every fitting step. The readings from the prospective experiment are deposited with the analysis code.</w:t>
       </w:r>
     </w:p>
     <w:p>
       <w:r>
-        <w:t>That code, both audit scripts, the headroom tool and machine-readable receipts recording the software versions each stage ran under are in a public repository (52), dual-licensed: the code under the Massachusetts Institute of Technology (MIT) licence, and the manuscript, figures and results under CC BY 4.0. The deposits keep their depositors' own licences. It is at https://github.com/piranfar/detection-floor-tolerance-endpoints, and this manuscript was built from commit 871c657+ of it.</w:t>
+        <w:t>That code, both audit scripts, the headroom tool and machine-readable receipts recording the software versions each stage ran under are in a public repository (52), dual-licensed: the code under the Massachusetts Institute of Technology (MIT) licence, and the manuscript, figures and results under CC BY 4.0. The deposits keep their depositors' own licences. It is at https://github.com/piranfar/detection-floor-tolerance-endpoints, and this manuscript was built from commit 9ea20a9+ of it.</w:t>
       </w:r>
     </w:p>
     <w:p>
@@ -4213,7 +4203,7 @@
     </w:p>
     <w:p>
       <w:r>
-        <w:t>The supplemental file carries the full Materials and Methods, the analyses named above as supplementary text, and 26 supplemental tables. Of those, 8 belong to analyses reported in that file rather than in this article, and are cited there at the point where each is used.</w:t>
+        <w:t>The supplemental file carries the full Materials and Methods, the analyses named above as supplementary text, and 26 supplemental tables. Of those, 9 belong to analyses reported in that file rather than in this article, and are cited there at the point where each is used.</w:t>
       </w:r>
     </w:p>
     <w:p>
@@ -6700,32 +6690,12 @@
     </w:p>
     <w:p>
       <w:r>
-        <w:t>7. Evangelopoulos D, Prosser G, Rodgers A, Dagg B, Khatri B, Bhagwat A, Gonzalo X, Kolyva A, Bertozzi G, Silva-Pereira TT, Gibbons N, Bhatt A, Sabharwal N, Perdigao J, Portugal I, Rodrigues C, Duarte R, Gomes M, Cirillo DM, McHugh TD. 2022. Data from: Comparative evaluation of viable count, molecular bacterial load and most probable number for the enumeration of Mycobacterium tuberculosis in murine tissue. University College London Research Data Repository. https://doi.org/10.5522/04/19175153.v2. Retrieved 2026-09-07.</w:t>
+        <w:t>7. Mann HB, Whitney DR. 1947. On a test of whether one of two random variables is stochastically larger than the other. Ann Math Stat 18:50-60. https://doi.org/10.1214/aoms/1177730491.</w:t>
       </w:r>
     </w:p>
     <w:p>
       <w:r>
-        <w:t>8. Mukamolova GV, Turapov O, Malkin J, Woltmann G, Barer MR. 2010. Resuscitation-promoting factors reveal an occult population of tubercle bacilli in sputum. Am J Respir Crit Care Med 181:174-180. https://doi.org/10.1164/rccm.200905-0661OC.</w:t>
-      </w:r>
-    </w:p>
-    <w:p>
-      <w:r>
-        <w:t>9. Chengalroyen MD, Beukes GM, Gordhan BG, Streicher EM, Churchyard G, Hafner R, Warren R, Otwombe K, Martinson N, Kana BD. 2016. Detection and quantification of differentially culturable tubercle bacteria in sputum from patients with tuberculosis. Am J Respir Crit Care Med 194:1532-1540. https://doi.org/10.1164/rccm.201604-0769OC.</w:t>
-      </w:r>
-    </w:p>
-    <w:p>
-      <w:r>
-        <w:t>10. Saito K, Warrier T, Somersan-Karakaya S, Kaminski L, Mi J, Jiang X, Park S, Shigyo K, Gold B, Roberts J, Weber E, Jacobs WR Jr, Nathan CF. 2017. Rifamycin action on RNA polymerase in antibiotic-tolerant Mycobacterium tuberculosis results in differentially detectable populations. Proc Natl Acad Sci U S A 114:E4832-E4840. https://doi.org/10.1073/pnas.1705385114.</w:t>
-      </w:r>
-    </w:p>
-    <w:p>
-      <w:r>
-        <w:t>11. Mann HB, Whitney DR. 1947. On a test of whether one of two random variables is stochastically larger than the other. Ann Math Stat 18:50-60. https://doi.org/10.1214/aoms/1177730491.</w:t>
-      </w:r>
-    </w:p>
-    <w:p>
-      <w:r>
-        <w:t xml:space="preserve">12. van Wijk RC, Lucía A, Sudhakar PK, Sonnenkalb L, Gaudin C, Hoffmann E, Dremierre B, Aguilar-Ayala DA, Dal Molin M, Rybniker J, de Giorgi S, Cioetto-Mazzabò L, Segafreddo G, Manganelli R, Degiacomi G, Recchia D, Pasca MR, Simonsson USH, Ramón-García S. 2023. Implementing best practices on data generation and reporting of </w:t>
+        <w:t xml:space="preserve">8. van Wijk RC, Lucía A, Sudhakar PK, Sonnenkalb L, Gaudin C, Hoffmann E, Dremierre B, Aguilar-Ayala DA, Dal Molin M, Rybniker J, de Giorgi S, Cioetto-Mazzabò L, Segafreddo G, Manganelli R, Degiacomi G, Recchia D, Pasca MR, Simonsson USH, Ramón-García S. 2023. Implementing best practices on data generation and reporting of </w:t>
       </w:r>
       <w:r>
         <w:rPr>
@@ -6739,7 +6709,7 @@
     </w:p>
     <w:p>
       <w:r>
-        <w:t xml:space="preserve">13. van Wijk RC, Lucía Quintana A, Ramón-García S. 2023. </w:t>
+        <w:t xml:space="preserve">9. van Wijk RC, Lucía Quintana A, Ramón-García S. 2023. </w:t>
       </w:r>
       <w:r>
         <w:rPr>
@@ -6753,7 +6723,7 @@
     </w:p>
     <w:p>
       <w:r>
-        <w:t xml:space="preserve">14. Dubey V, Darlow C, Gerada A, Unsworth J, Sheth E, Reza N, Farrington N, Haldenby S, Warren D, Liu X, Howard A, Hope W. 2026. Molecular pharmacodynamics of amoxicillin-clavulanic acid for urinary tract infections caused by </w:t>
+        <w:t xml:space="preserve">10. Dubey V, Darlow C, Gerada A, Unsworth J, Sheth E, Reza N, Farrington N, Haldenby S, Warren D, Liu X, Howard A, Hope W. 2026. Molecular pharmacodynamics of amoxicillin-clavulanic acid for urinary tract infections caused by </w:t>
       </w:r>
       <w:r>
         <w:rPr>
@@ -6767,7 +6737,7 @@
     </w:p>
     <w:p>
       <w:r>
-        <w:t xml:space="preserve">15. Dubey V, Darlow C, Gerada A, Unsworth J, Sheth E, Reza N, Farrington N, Haldenby S, Warren D, Liu X, Howard A, Hope W. 2026. Source Data to "Molecular pharmacodynamics of amoxicillin-clavulanic acid for urinary tract infections caused by </w:t>
+        <w:t xml:space="preserve">11. Dubey V, Darlow C, Gerada A, Unsworth J, Sheth E, Reza N, Farrington N, Haldenby S, Warren D, Liu X, Howard A, Hope W. 2026. Source Data to "Molecular pharmacodynamics of amoxicillin-clavulanic acid for urinary tract infections caused by </w:t>
       </w:r>
       <w:r>
         <w:rPr>
@@ -6777,6 +6747,26 @@
       </w:r>
       <w:r>
         <w:t>" (41467_2026_74323_MOESM4_ESM.xlsx). Nature Communications. https://doi.org/10.1038/s41467-026-74323-2.</w:t>
+      </w:r>
+    </w:p>
+    <w:p>
+      <w:r>
+        <w:t>12. Evangelopoulos D, Prosser G, Rodgers A, Dagg B, Khatri B, Bhagwat A, Gonzalo X, Kolyva A, Bertozzi G, Silva-Pereira TT, Gibbons N, Bhatt A, Sabharwal N, Perdigao J, Portugal I, Rodrigues C, Duarte R, Gomes M, Cirillo DM, McHugh TD. 2022. Data from: Comparative evaluation of viable count, molecular bacterial load and most probable number for the enumeration of Mycobacterium tuberculosis in murine tissue. University College London Research Data Repository. https://doi.org/10.5522/04/19175153.v2. Retrieved 2026-09-07.</w:t>
+      </w:r>
+    </w:p>
+    <w:p>
+      <w:r>
+        <w:t>13. Mukamolova GV, Turapov O, Malkin J, Woltmann G, Barer MR. 2010. Resuscitation-promoting factors reveal an occult population of tubercle bacilli in sputum. Am J Respir Crit Care Med 181:174-180. https://doi.org/10.1164/rccm.200905-0661OC.</w:t>
+      </w:r>
+    </w:p>
+    <w:p>
+      <w:r>
+        <w:t>14. Chengalroyen MD, Beukes GM, Gordhan BG, Streicher EM, Churchyard G, Hafner R, Warren R, Otwombe K, Martinson N, Kana BD. 2016. Detection and quantification of differentially culturable tubercle bacteria in sputum from patients with tuberculosis. Am J Respir Crit Care Med 194:1532-1540. https://doi.org/10.1164/rccm.201604-0769OC.</w:t>
+      </w:r>
+    </w:p>
+    <w:p>
+      <w:r>
+        <w:t>15. Saito K, Warrier T, Somersan-Karakaya S, Kaminski L, Mi J, Jiang X, Park S, Shigyo K, Gold B, Roberts J, Weber E, Jacobs WR Jr, Nathan CF. 2017. Rifamycin action on RNA polymerase in antibiotic-tolerant Mycobacterium tuberculosis results in differentially detectable populations. Proc Natl Acad Sci U S A 114:E4832-E4840. https://doi.org/10.1073/pnas.1705385114.</w:t>
       </w:r>
     </w:p>
     <w:p>

</xml_diff>

<commit_message>
Fix two swapped Section-number references in Methods
The corpus-description paragraph in Methods pointed to Section 9 for
the apramycin analysis and Section 8 for the Dubey validation deposit;
after an earlier renumbering pass the two should have been the
reverse. Fixed both.
</commit_message>
<xml_diff>
--- a/submission/02_manuscript.docx
+++ b/submission/02_manuscript.docx
@@ -2860,7 +2860,7 @@
         <w:t>M. tuberculosis</w:t>
       </w:r>
       <w:r>
-        <w:t xml:space="preserve"> at 128, 32, 8, 4 and 1 µg/mL, triplicate log10 CFU at days 0, 3, 7 and 14 (Kaur et al. 2024; figshare 26462791, CC BY 4.0) (25, 26). The 1 µg/mL arm shows net growth rather than killing and is excluded from the dose comparison, leaving 4 to 128 µg/mL as the range compared (Section 6).</w:t>
+        <w:t xml:space="preserve"> at 128, 32, 8, 4 and 1 µg/mL, triplicate log10 CFU at days 0, 3, 7 and 14 (Kaur et al. 2024; figshare 26462791, CC BY 4.0) (25, 26). The 1 µg/mL arm shows net growth rather than killing and is excluded from the dose comparison, leaving 4 to 128 µg/mL as the range compared (Text S3).</w:t>
       </w:r>
     </w:p>
     <w:p>
@@ -2883,7 +2883,7 @@
         <w:t>Escherichia coli</w:t>
       </w:r>
       <w:r>
-        <w:t xml:space="preserve"> in a hollow-fibre infection model, with 100 µL plated, measured day-zero densities for every culture, and below-limit readings retained as a placeholder (Dubey et al. 2026; article Source Data, CC BY 4.0) (10, 11). It was the only deposit found carrying all three fields the boundaries require, and no boundary, threshold or modelling choice in this paper was informed by it; it is used nowhere else in the paper except to confirm them (Text S3).</w:t>
+        <w:t xml:space="preserve"> in a hollow-fibre infection model, with 100 µL plated, measured day-zero densities for every culture, and below-limit readings retained as a placeholder (Dubey et al. 2026; article Source Data, CC BY 4.0) (10, 11). It was the only deposit found carrying all three fields the boundaries require, and no boundary, threshold or modelling choice in this paper was informed by it; it is used nowhere else in the paper except to confirm them (Section 6).</w:t>
       </w:r>
     </w:p>
     <w:p>
@@ -3775,7 +3775,7 @@
     </w:p>
     <w:p>
       <w:r>
-        <w:t>That code, both audit scripts, the headroom tool and machine-readable receipts recording the software versions each stage ran under are in a public repository (52), dual-licensed: the code under the Massachusetts Institute of Technology (MIT) licence, and the manuscript, figures and results under CC BY 4.0. The deposits keep their depositors' own licences. It is at https://github.com/piranfar/detection-floor-tolerance-endpoints, and this manuscript was built from commit ac74e4a+ of it.</w:t>
+        <w:t>That code, both audit scripts, the headroom tool and machine-readable receipts recording the software versions each stage ran under are in a public repository (52), dual-licensed: the code under the Massachusetts Institute of Technology (MIT) licence, and the manuscript, figures and results under CC BY 4.0. The deposits keep their depositors' own licences. It is at https://github.com/piranfar/detection-floor-tolerance-endpoints, and this manuscript was built from commit 6990c62+ of it.</w:t>
       </w:r>
     </w:p>
     <w:p>

</xml_diff>

<commit_message>
Restore a Discussion paragraph that Results depends on
Results tells the reader that the Discussion weighs two competing
readings of the isoniazid-resistance association (mediator vs.
confounder). That paragraph had been moved to the supplement in an
earlier pass, so the main text never delivered on the reference.
Moved it back into the main-text Discussion.
</commit_message>
<xml_diff>
--- a/submission/02_manuscript.docx
+++ b/submission/02_manuscript.docx
@@ -1981,6 +1981,11 @@
     </w:p>
     <w:p>
       <w:r>
+        <w:t>Starting density could sit on the causal path rather than beside it. Suppose resistance slows growth, and slow growth causes genuine tolerance: then the thin inoculum is a consequence of the slow growth, and adjusting for it would remove real signal rather than a confounder. The asymmetry favours the confounding reading, since growth survives adjustment and resistance does not, but a design that fixes the inoculum would settle it.</w:t>
+      </w:r>
+    </w:p>
+    <w:p>
+      <w:r>
         <w:rPr>
           <w:b/>
         </w:rPr>
@@ -3775,7 +3780,7 @@
     </w:p>
     <w:p>
       <w:r>
-        <w:t>That code, both audit scripts, the headroom tool and machine-readable receipts recording the software versions each stage ran under are in a public repository (52), dual-licensed: the code under the Massachusetts Institute of Technology (MIT) licence, and the manuscript, figures and results under CC BY 4.0. The deposits keep their depositors' own licences. It is at https://github.com/piranfar/detection-floor-tolerance-endpoints, and this manuscript was built from commit 6990c62+ of it.</w:t>
+        <w:t>That code, both audit scripts, the headroom tool and machine-readable receipts recording the software versions each stage ran under are in a public repository (52), dual-licensed: the code under the Massachusetts Institute of Technology (MIT) licence, and the manuscript, figures and results under CC BY 4.0. The deposits keep their depositors' own licences. It is at https://github.com/piranfar/detection-floor-tolerance-endpoints, and this manuscript was built from commit dc28972+ of it.</w:t>
       </w:r>
     </w:p>
     <w:p>

</xml_diff>

<commit_message>
Render markdown links as text in the Word build
write_runs handled **bold** and *italic* but not [text](url), so a link
reached the .docx with its markdown syntax intact. The ORCID line in the
front matter was affected, printing
"[0000-0003-3653-5739](https://orcid.org/0000-0003-3653-5739)" on the
first page of the submission file.

Added the link form to the INLINE alternation ahead of the emphasis
patterns so a link's own label is not re-split, and render it as the label
alone when the label already appears in the URL, otherwise as "label
(url)". The URL pattern excludes whitespace and the label excludes
newlines, so bracketed mathematics such as the interval [0, L/N0] is not
matched.

Covered by seven cases checked against expected output: the ORCID line, a
DOI link with distinct label text, bold, italic, all three in one line,
the interval notation that must stay unchanged, and plain text.
</commit_message>
<xml_diff>
--- a/submission/02_manuscript.docx
+++ b/submission/02_manuscript.docx
@@ -47,7 +47,10 @@
     </w:p>
     <w:p>
       <w:r>
-        <w:t>ORCID: [0000-0003-3653-5739](https://orcid.org/0000-0003-3653-5739)</w:t>
+        <w:t xml:space="preserve">ORCID: </w:t>
+      </w:r>
+      <w:r>
+        <w:t>0000-0003-3653-5739</w:t>
       </w:r>
     </w:p>
     <w:p>

</xml_diff>